<commit_message>
Revision to checkin doc
Former-commit-id: 8eeaf501ac88de205377d9d201cf2daa15385f8c
</commit_message>
<xml_diff>
--- a/Checkins/CheckinReport CSV Parsing.docx
+++ b/Checkins/CheckinReport CSV Parsing.docx
@@ -38,14 +38,17 @@
       <w:r>
         <w:t xml:space="preserve"> SE</w:t>
       </w:r>
+    </w:p>
+    <w:p/>
+    <w:p>
+      <w:r>
+        <w:t xml:space="preserve">CHECK-IN/HASH (from bitbucket.org) </w:t>
+      </w:r>
+      <w:r>
+        <w:t>99fc88d</w:t>
+      </w:r>
       <w:bookmarkStart w:id="0" w:name="_GoBack"/>
       <w:bookmarkEnd w:id="0"/>
-    </w:p>
-    <w:p/>
-    <w:p>
-      <w:r>
-        <w:t>CHECK-IN/HASH (from bitbucket.org) _________________________</w:t>
-      </w:r>
     </w:p>
     <w:p/>
     <w:p/>
@@ -471,19 +474,7 @@
         <w:rPr>
           <w:rFonts w:ascii="Menlo" w:hAnsi="Menlo" w:cs="Menlo"/>
         </w:rPr>
-        <w:t xml:space="preserve"> </w:t>
-      </w:r>
-      <w:r>
-        <w:rPr>
-          <w:rFonts w:ascii="Menlo" w:hAnsi="Menlo" w:cs="Menlo"/>
-        </w:rPr>
-        <w:t>&lt;char&gt;</w:t>
-      </w:r>
-      <w:r>
-        <w:rPr>
-          <w:rFonts w:ascii="Menlo" w:hAnsi="Menlo" w:cs="Menlo"/>
-        </w:rPr>
-        <w:t xml:space="preserve"> </w:t>
+        <w:t xml:space="preserve"> &lt;char&gt; </w:t>
       </w:r>
       <w:r>
         <w:rPr>
@@ -502,13 +493,7 @@
         <w:rPr>
           <w:rFonts w:ascii="Menlo" w:hAnsi="Menlo" w:cs="Menlo"/>
         </w:rPr>
-        <w:t>none</w:t>
-      </w:r>
-      <w:r>
-        <w:rPr>
-          <w:rFonts w:ascii="Menlo" w:hAnsi="Menlo" w:cs="Menlo"/>
-        </w:rPr>
-        <w:t xml:space="preserve"> ]</w:t>
+        <w:t>none ]</w:t>
       </w:r>
       <w:proofErr w:type="gramEnd"/>
     </w:p>
@@ -541,38 +526,14 @@
         <w:rPr>
           <w:rFonts w:ascii="Menlo" w:hAnsi="Menlo" w:cs="Menlo"/>
         </w:rPr>
-        <w:t xml:space="preserve"> </w:t>
-      </w:r>
-      <w:r>
-        <w:rPr>
-          <w:rFonts w:ascii="Menlo" w:hAnsi="Menlo" w:cs="Menlo"/>
-        </w:rPr>
-        <w:t>&lt;char&gt;</w:t>
-      </w:r>
-      <w:r>
-        <w:rPr>
-          <w:rFonts w:ascii="Menlo" w:hAnsi="Menlo" w:cs="Menlo"/>
-        </w:rPr>
-        <w:t xml:space="preserve"> </w:t>
-      </w:r>
-      <w:r>
-        <w:rPr>
-          <w:rFonts w:ascii="Menlo" w:hAnsi="Menlo" w:cs="Menlo"/>
-        </w:rPr>
-        <w:t xml:space="preserve">| </w:t>
+        <w:t xml:space="preserve"> &lt;char&gt; | </w:t>
       </w:r>
       <w:proofErr w:type="gramStart"/>
       <w:r>
         <w:rPr>
           <w:rFonts w:ascii="Menlo" w:hAnsi="Menlo" w:cs="Menlo"/>
         </w:rPr>
-        <w:t>none</w:t>
-      </w:r>
-      <w:r>
-        <w:rPr>
-          <w:rFonts w:ascii="Menlo" w:hAnsi="Menlo" w:cs="Menlo"/>
-        </w:rPr>
-        <w:t xml:space="preserve"> ]</w:t>
+        <w:t>none ]</w:t>
       </w:r>
       <w:proofErr w:type="gramEnd"/>
     </w:p>
@@ -593,38 +554,14 @@
         <w:rPr>
           <w:rFonts w:ascii="Menlo" w:hAnsi="Menlo" w:cs="Menlo"/>
         </w:rPr>
-        <w:t xml:space="preserve"> </w:t>
-      </w:r>
-      <w:r>
-        <w:rPr>
-          <w:rFonts w:ascii="Menlo" w:hAnsi="Menlo" w:cs="Menlo"/>
-        </w:rPr>
-        <w:t>&lt;char&gt;</w:t>
-      </w:r>
-      <w:r>
-        <w:rPr>
-          <w:rFonts w:ascii="Menlo" w:hAnsi="Menlo" w:cs="Menlo"/>
-        </w:rPr>
-        <w:t xml:space="preserve"> </w:t>
-      </w:r>
-      <w:r>
-        <w:rPr>
-          <w:rFonts w:ascii="Menlo" w:hAnsi="Menlo" w:cs="Menlo"/>
-        </w:rPr>
-        <w:t xml:space="preserve">| </w:t>
+        <w:t xml:space="preserve"> &lt;char&gt; | </w:t>
       </w:r>
       <w:proofErr w:type="gramStart"/>
       <w:r>
         <w:rPr>
           <w:rFonts w:ascii="Menlo" w:hAnsi="Menlo" w:cs="Menlo"/>
         </w:rPr>
-        <w:t>none</w:t>
-      </w:r>
-      <w:r>
-        <w:rPr>
-          <w:rFonts w:ascii="Menlo" w:hAnsi="Menlo" w:cs="Menlo"/>
-        </w:rPr>
-        <w:t xml:space="preserve"> ]</w:t>
+        <w:t>none ]</w:t>
       </w:r>
       <w:proofErr w:type="gramEnd"/>
     </w:p>
@@ -738,27 +675,83 @@
         <w:rPr>
           <w:rFonts w:ascii="Menlo" w:hAnsi="Menlo" w:cs="Menlo"/>
         </w:rPr>
-        <w:t xml:space="preserve">[ TERMINATOR </w:t>
-      </w:r>
-      <w:r>
-        <w:rPr>
-          <w:rFonts w:ascii="Menlo" w:hAnsi="Menlo" w:cs="Menlo"/>
-        </w:rPr>
-        <w:t>“</w:t>
-      </w:r>
-      <w:r>
-        <w:rPr>
-          <w:rFonts w:ascii="Menlo" w:hAnsi="Menlo" w:cs="Menlo"/>
-        </w:rPr>
-        <w:t>&lt;char</w:t>
+        <w:t>[ TERMINATOR “&lt;char</w:t>
       </w:r>
       <w:proofErr w:type="gramStart"/>
       <w:r>
         <w:rPr>
           <w:rFonts w:ascii="Menlo" w:hAnsi="Menlo" w:cs="Menlo"/>
         </w:rPr>
-        <w:t>&gt;</w:t>
-      </w:r>
+        <w:t xml:space="preserve">&gt;” </w:t>
+      </w:r>
+      <w:r>
+        <w:rPr>
+          <w:rFonts w:ascii="Menlo" w:hAnsi="Menlo" w:cs="Menlo"/>
+        </w:rPr>
+        <w:t xml:space="preserve"> </w:t>
+      </w:r>
+      <w:r>
+        <w:rPr>
+          <w:rFonts w:ascii="Menlo" w:hAnsi="Menlo" w:cs="Menlo"/>
+        </w:rPr>
+        <w:t>|</w:t>
+      </w:r>
+      <w:proofErr w:type="gramEnd"/>
+      <w:r>
+        <w:rPr>
+          <w:rFonts w:ascii="Menlo" w:hAnsi="Menlo" w:cs="Menlo"/>
+        </w:rPr>
+        <w:t xml:space="preserve"> “\0” ]</w:t>
+      </w:r>
+    </w:p>
+    <w:p>
+      <w:pPr>
+        <w:ind w:left="720" w:firstLine="720"/>
+        <w:rPr>
+          <w:rFonts w:ascii="Menlo" w:hAnsi="Menlo" w:cs="Menlo"/>
+        </w:rPr>
+      </w:pPr>
+      <w:r>
+        <w:rPr>
+          <w:rFonts w:ascii="Menlo" w:hAnsi="Menlo" w:cs="Menlo"/>
+        </w:rPr>
+        <w:t>[ DELIMITER “&lt;char</w:t>
+      </w:r>
+      <w:proofErr w:type="gramStart"/>
+      <w:r>
+        <w:rPr>
+          <w:rFonts w:ascii="Menlo" w:hAnsi="Menlo" w:cs="Menlo"/>
+        </w:rPr>
+        <w:t xml:space="preserve">&gt;” </w:t>
+      </w:r>
+      <w:r>
+        <w:rPr>
+          <w:rFonts w:ascii="Menlo" w:hAnsi="Menlo" w:cs="Menlo"/>
+        </w:rPr>
+        <w:t xml:space="preserve">  </w:t>
+      </w:r>
+      <w:proofErr w:type="gramEnd"/>
+      <w:r>
+        <w:rPr>
+          <w:rFonts w:ascii="Menlo" w:hAnsi="Menlo" w:cs="Menlo"/>
+        </w:rPr>
+        <w:t>| “\0” ]</w:t>
+      </w:r>
+    </w:p>
+    <w:p>
+      <w:pPr>
+        <w:ind w:left="720" w:firstLine="720"/>
+        <w:rPr>
+          <w:rFonts w:ascii="Menlo" w:hAnsi="Menlo" w:cs="Menlo"/>
+        </w:rPr>
+      </w:pPr>
+      <w:r>
+        <w:rPr>
+          <w:rFonts w:ascii="Menlo" w:hAnsi="Menlo" w:cs="Menlo"/>
+        </w:rPr>
+        <w:t>[ ENCLOSED_BY “&lt;char&gt;” | “\0</w:t>
+      </w:r>
+      <w:proofErr w:type="gramStart"/>
       <w:r>
         <w:rPr>
           <w:rFonts w:ascii="Menlo" w:hAnsi="Menlo" w:cs="Menlo"/>
@@ -775,33 +768,9 @@
         <w:rPr>
           <w:rFonts w:ascii="Menlo" w:hAnsi="Menlo" w:cs="Menlo"/>
         </w:rPr>
-        <w:t xml:space="preserve"> </w:t>
-      </w:r>
-      <w:r>
-        <w:rPr>
-          <w:rFonts w:ascii="Menlo" w:hAnsi="Menlo" w:cs="Menlo"/>
-        </w:rPr>
-        <w:t>|</w:t>
+        <w:t>]</w:t>
       </w:r>
       <w:proofErr w:type="gramEnd"/>
-      <w:r>
-        <w:rPr>
-          <w:rFonts w:ascii="Menlo" w:hAnsi="Menlo" w:cs="Menlo"/>
-        </w:rPr>
-        <w:t xml:space="preserve"> </w:t>
-      </w:r>
-      <w:r>
-        <w:rPr>
-          <w:rFonts w:ascii="Menlo" w:hAnsi="Menlo" w:cs="Menlo"/>
-        </w:rPr>
-        <w:t>“\0”</w:t>
-      </w:r>
-      <w:r>
-        <w:rPr>
-          <w:rFonts w:ascii="Menlo" w:hAnsi="Menlo" w:cs="Menlo"/>
-        </w:rPr>
-        <w:t xml:space="preserve"> ]</w:t>
-      </w:r>
     </w:p>
     <w:p>
       <w:pPr>
@@ -814,178 +783,14 @@
         <w:rPr>
           <w:rFonts w:ascii="Menlo" w:hAnsi="Menlo" w:cs="Menlo"/>
         </w:rPr>
-        <w:t xml:space="preserve">[ DELIMITER </w:t>
-      </w:r>
-      <w:r>
-        <w:rPr>
-          <w:rFonts w:ascii="Menlo" w:hAnsi="Menlo" w:cs="Menlo"/>
-        </w:rPr>
-        <w:t>“</w:t>
-      </w:r>
-      <w:r>
-        <w:rPr>
-          <w:rFonts w:ascii="Menlo" w:hAnsi="Menlo" w:cs="Menlo"/>
-        </w:rPr>
-        <w:t>&lt;char</w:t>
+        <w:t>[ ESCAPE_CHAR “&lt;char&gt;” | “\0</w:t>
       </w:r>
       <w:proofErr w:type="gramStart"/>
       <w:r>
         <w:rPr>
           <w:rFonts w:ascii="Menlo" w:hAnsi="Menlo" w:cs="Menlo"/>
         </w:rPr>
-        <w:t>&gt;</w:t>
-      </w:r>
-      <w:r>
-        <w:rPr>
-          <w:rFonts w:ascii="Menlo" w:hAnsi="Menlo" w:cs="Menlo"/>
-        </w:rPr>
-        <w:t>”</w:t>
-      </w:r>
-      <w:r>
-        <w:rPr>
-          <w:rFonts w:ascii="Menlo" w:hAnsi="Menlo" w:cs="Menlo"/>
-        </w:rPr>
-        <w:t xml:space="preserve"> </w:t>
-      </w:r>
-      <w:r>
-        <w:rPr>
-          <w:rFonts w:ascii="Menlo" w:hAnsi="Menlo" w:cs="Menlo"/>
-        </w:rPr>
-        <w:t xml:space="preserve">  </w:t>
-      </w:r>
-      <w:proofErr w:type="gramEnd"/>
-      <w:r>
-        <w:rPr>
-          <w:rFonts w:ascii="Menlo" w:hAnsi="Menlo" w:cs="Menlo"/>
-        </w:rPr>
-        <w:t>| “\0”</w:t>
-      </w:r>
-      <w:r>
-        <w:rPr>
-          <w:rFonts w:ascii="Menlo" w:hAnsi="Menlo" w:cs="Menlo"/>
-        </w:rPr>
-        <w:t xml:space="preserve"> </w:t>
-      </w:r>
-      <w:r>
-        <w:rPr>
-          <w:rFonts w:ascii="Menlo" w:hAnsi="Menlo" w:cs="Menlo"/>
-        </w:rPr>
-        <w:t>]</w:t>
-      </w:r>
-    </w:p>
-    <w:p>
-      <w:pPr>
-        <w:ind w:left="720" w:firstLine="720"/>
-        <w:rPr>
-          <w:rFonts w:ascii="Menlo" w:hAnsi="Menlo" w:cs="Menlo"/>
-        </w:rPr>
-      </w:pPr>
-      <w:r>
-        <w:rPr>
-          <w:rFonts w:ascii="Menlo" w:hAnsi="Menlo" w:cs="Menlo"/>
-        </w:rPr>
-        <w:t xml:space="preserve">[ ENCLOSED_BY </w:t>
-      </w:r>
-      <w:r>
-        <w:rPr>
-          <w:rFonts w:ascii="Menlo" w:hAnsi="Menlo" w:cs="Menlo"/>
-        </w:rPr>
-        <w:t>“</w:t>
-      </w:r>
-      <w:r>
-        <w:rPr>
-          <w:rFonts w:ascii="Menlo" w:hAnsi="Menlo" w:cs="Menlo"/>
-        </w:rPr>
-        <w:t>&lt;char&gt;</w:t>
-      </w:r>
-      <w:r>
-        <w:rPr>
-          <w:rFonts w:ascii="Menlo" w:hAnsi="Menlo" w:cs="Menlo"/>
-        </w:rPr>
-        <w:t>”</w:t>
-      </w:r>
-      <w:r>
-        <w:rPr>
-          <w:rFonts w:ascii="Menlo" w:hAnsi="Menlo" w:cs="Menlo"/>
-        </w:rPr>
-        <w:t xml:space="preserve"> | “\0</w:t>
-      </w:r>
-      <w:proofErr w:type="gramStart"/>
-      <w:r>
-        <w:rPr>
-          <w:rFonts w:ascii="Menlo" w:hAnsi="Menlo" w:cs="Menlo"/>
-        </w:rPr>
-        <w:t>”</w:t>
-      </w:r>
-      <w:r>
-        <w:rPr>
-          <w:rFonts w:ascii="Menlo" w:hAnsi="Menlo" w:cs="Menlo"/>
-        </w:rPr>
-        <w:t xml:space="preserve"> </w:t>
-      </w:r>
-      <w:r>
-        <w:rPr>
-          <w:rFonts w:ascii="Menlo" w:hAnsi="Menlo" w:cs="Menlo"/>
-        </w:rPr>
-        <w:t>]</w:t>
-      </w:r>
-      <w:proofErr w:type="gramEnd"/>
-    </w:p>
-    <w:p>
-      <w:pPr>
-        <w:ind w:left="720" w:firstLine="720"/>
-        <w:rPr>
-          <w:rFonts w:ascii="Menlo" w:hAnsi="Menlo" w:cs="Menlo"/>
-        </w:rPr>
-      </w:pPr>
-      <w:r>
-        <w:rPr>
-          <w:rFonts w:ascii="Menlo" w:hAnsi="Menlo" w:cs="Menlo"/>
-        </w:rPr>
-        <w:t xml:space="preserve">[ ESCAPE_CHAR </w:t>
-      </w:r>
-      <w:r>
-        <w:rPr>
-          <w:rFonts w:ascii="Menlo" w:hAnsi="Menlo" w:cs="Menlo"/>
-        </w:rPr>
-        <w:t>“</w:t>
-      </w:r>
-      <w:r>
-        <w:rPr>
-          <w:rFonts w:ascii="Menlo" w:hAnsi="Menlo" w:cs="Menlo"/>
-        </w:rPr>
-        <w:t>&lt;char&gt;</w:t>
-      </w:r>
-      <w:r>
-        <w:rPr>
-          <w:rFonts w:ascii="Menlo" w:hAnsi="Menlo" w:cs="Menlo"/>
-        </w:rPr>
-        <w:t>”</w:t>
-      </w:r>
-      <w:r>
-        <w:rPr>
-          <w:rFonts w:ascii="Menlo" w:hAnsi="Menlo" w:cs="Menlo"/>
-        </w:rPr>
-        <w:t xml:space="preserve"> | “\0</w:t>
-      </w:r>
-      <w:proofErr w:type="gramStart"/>
-      <w:r>
-        <w:rPr>
-          <w:rFonts w:ascii="Menlo" w:hAnsi="Menlo" w:cs="Menlo"/>
-        </w:rPr>
-        <w:t>”</w:t>
-      </w:r>
-      <w:r>
-        <w:rPr>
-          <w:rFonts w:ascii="Menlo" w:hAnsi="Menlo" w:cs="Menlo"/>
-        </w:rPr>
-        <w:t xml:space="preserve"> </w:t>
-      </w:r>
-      <w:r>
-        <w:rPr>
-          <w:rFonts w:ascii="Menlo" w:hAnsi="Menlo" w:cs="Menlo"/>
-        </w:rPr>
-        <w:t>]</w:t>
+        <w:t>” ]</w:t>
       </w:r>
       <w:proofErr w:type="gramEnd"/>
     </w:p>

</xml_diff>

<commit_message>
Correction to check-in report for loading error
Former-commit-id: b7ca56372ea49b39df98e07b30741921f8db8146
</commit_message>
<xml_diff>
--- a/Checkins/CheckinReport CSV Parsing.docx
+++ b/Checkins/CheckinReport CSV Parsing.docx
@@ -21,13 +21,8 @@
       <w:r>
         <w:t xml:space="preserve">DEVELOPER: </w:t>
       </w:r>
-      <w:proofErr w:type="spellStart"/>
-      <w:r>
-        <w:t>Alka</w:t>
-      </w:r>
-      <w:proofErr w:type="spellEnd"/>
-      <w:r>
-        <w:t xml:space="preserve"> &amp; Ray</w:t>
+      <w:r>
+        <w:t>Alka &amp; Ray</w:t>
       </w:r>
     </w:p>
     <w:p/>
@@ -45,10 +40,14 @@
         <w:t xml:space="preserve">CHECK-IN/HASH (from bitbucket.org) </w:t>
       </w:r>
       <w:r>
-        <w:t>99fc88d</w:t>
-      </w:r>
-      <w:bookmarkStart w:id="0" w:name="_GoBack"/>
-      <w:bookmarkEnd w:id="0"/>
+        <w:t>0</w:t>
+      </w:r>
+      <w:r>
+        <w:t>b</w:t>
+      </w:r>
+      <w:r>
+        <w:t>69708</w:t>
+      </w:r>
     </w:p>
     <w:p/>
     <w:p/>
@@ -344,21 +343,7 @@
         <w:rPr>
           <w:rFonts w:ascii="Menlo" w:hAnsi="Menlo" w:cs="Menlo"/>
         </w:rPr>
-        <w:t xml:space="preserve"> &lt;</w:t>
-      </w:r>
-      <w:proofErr w:type="spellStart"/>
-      <w:r>
-        <w:rPr>
-          <w:rFonts w:ascii="Menlo" w:hAnsi="Menlo" w:cs="Menlo"/>
-        </w:rPr>
-        <w:t>connectorName</w:t>
-      </w:r>
-      <w:proofErr w:type="spellEnd"/>
-      <w:r>
-        <w:rPr>
-          <w:rFonts w:ascii="Menlo" w:hAnsi="Menlo" w:cs="Menlo"/>
-        </w:rPr>
-        <w:t>&gt;</w:t>
+        <w:t xml:space="preserve"> &lt;connectorName&gt;</w:t>
       </w:r>
       <w:r>
         <w:rPr>
@@ -376,21 +361,7 @@
         <w:rPr>
           <w:rFonts w:ascii="Menlo" w:hAnsi="Menlo" w:cs="Menlo"/>
         </w:rPr>
-        <w:t>d &lt;</w:t>
-      </w:r>
-      <w:proofErr w:type="spellStart"/>
-      <w:r>
-        <w:rPr>
-          <w:rFonts w:ascii="Menlo" w:hAnsi="Menlo" w:cs="Menlo"/>
-        </w:rPr>
-        <w:t>tableName</w:t>
-      </w:r>
-      <w:proofErr w:type="spellEnd"/>
-      <w:r>
-        <w:rPr>
-          <w:rFonts w:ascii="Menlo" w:hAnsi="Menlo" w:cs="Menlo"/>
-        </w:rPr>
-        <w:t xml:space="preserve">&gt; &lt;filename&gt; </w:t>
+        <w:t xml:space="preserve">d &lt;tableName&gt; &lt;filename&gt; </w:t>
       </w:r>
     </w:p>
     <w:p>
@@ -422,14 +393,7 @@
         <w:rPr>
           <w:rFonts w:ascii="Menlo" w:hAnsi="Menlo" w:cs="Menlo"/>
         </w:rPr>
-        <w:t>&lt;char</w:t>
-      </w:r>
-      <w:proofErr w:type="gramStart"/>
-      <w:r>
-        <w:rPr>
-          <w:rFonts w:ascii="Menlo" w:hAnsi="Menlo" w:cs="Menlo"/>
-        </w:rPr>
-        <w:t xml:space="preserve">&gt; </w:t>
+        <w:t xml:space="preserve">&lt;char&gt; </w:t>
       </w:r>
       <w:r>
         <w:rPr>
@@ -441,14 +405,7 @@
         <w:rPr>
           <w:rFonts w:ascii="Menlo" w:hAnsi="Menlo" w:cs="Menlo"/>
         </w:rPr>
-        <w:t>|</w:t>
-      </w:r>
-      <w:proofErr w:type="gramEnd"/>
-      <w:r>
-        <w:rPr>
-          <w:rFonts w:ascii="Menlo" w:hAnsi="Menlo" w:cs="Menlo"/>
-        </w:rPr>
-        <w:t xml:space="preserve"> none ]</w:t>
+        <w:t>| none ]</w:t>
       </w:r>
     </w:p>
     <w:p>
@@ -486,16 +443,8 @@
         <w:rPr>
           <w:rFonts w:ascii="Menlo" w:hAnsi="Menlo" w:cs="Menlo"/>
         </w:rPr>
-        <w:t xml:space="preserve">| </w:t>
-      </w:r>
-      <w:proofErr w:type="gramStart"/>
-      <w:r>
-        <w:rPr>
-          <w:rFonts w:ascii="Menlo" w:hAnsi="Menlo" w:cs="Menlo"/>
-        </w:rPr>
-        <w:t>none ]</w:t>
-      </w:r>
-      <w:proofErr w:type="gramEnd"/>
+        <w:t>| none ]</w:t>
+      </w:r>
     </w:p>
     <w:p>
       <w:pPr>
@@ -526,16 +475,8 @@
         <w:rPr>
           <w:rFonts w:ascii="Menlo" w:hAnsi="Menlo" w:cs="Menlo"/>
         </w:rPr>
-        <w:t xml:space="preserve"> &lt;char&gt; | </w:t>
-      </w:r>
-      <w:proofErr w:type="gramStart"/>
-      <w:r>
-        <w:rPr>
-          <w:rFonts w:ascii="Menlo" w:hAnsi="Menlo" w:cs="Menlo"/>
-        </w:rPr>
-        <w:t>none ]</w:t>
-      </w:r>
-      <w:proofErr w:type="gramEnd"/>
+        <w:t xml:space="preserve"> &lt;char&gt; | none ]</w:t>
+      </w:r>
     </w:p>
     <w:p>
       <w:pPr>
@@ -554,16 +495,8 @@
         <w:rPr>
           <w:rFonts w:ascii="Menlo" w:hAnsi="Menlo" w:cs="Menlo"/>
         </w:rPr>
-        <w:t xml:space="preserve"> &lt;char&gt; | </w:t>
-      </w:r>
-      <w:proofErr w:type="gramStart"/>
-      <w:r>
-        <w:rPr>
-          <w:rFonts w:ascii="Menlo" w:hAnsi="Menlo" w:cs="Menlo"/>
-        </w:rPr>
-        <w:t>none ]</w:t>
-      </w:r>
-      <w:proofErr w:type="gramEnd"/>
+        <w:t xml:space="preserve"> &lt;char&gt; | none ]</w:t>
+      </w:r>
     </w:p>
     <w:p>
       <w:pPr>
@@ -572,7 +505,6 @@
           <w:rFonts w:ascii="Menlo" w:hAnsi="Menlo" w:cs="Menlo"/>
         </w:rPr>
       </w:pPr>
-      <w:proofErr w:type="gramStart"/>
       <w:r>
         <w:rPr>
           <w:rFonts w:ascii="Menlo" w:hAnsi="Menlo" w:cs="Menlo"/>
@@ -583,28 +515,7 @@
         <w:rPr>
           <w:rFonts w:ascii="Menlo" w:hAnsi="Menlo" w:cs="Menlo"/>
         </w:rPr>
-        <w:t xml:space="preserve"> WITH</w:t>
-      </w:r>
-      <w:proofErr w:type="gramEnd"/>
-      <w:r>
-        <w:rPr>
-          <w:rFonts w:ascii="Menlo" w:hAnsi="Menlo" w:cs="Menlo"/>
-        </w:rPr>
-        <w:t xml:space="preserve"> NODE = ‘&lt;</w:t>
-      </w:r>
-      <w:proofErr w:type="spellStart"/>
-      <w:r>
-        <w:rPr>
-          <w:rFonts w:ascii="Menlo" w:hAnsi="Menlo" w:cs="Menlo"/>
-        </w:rPr>
-        <w:t>nodeName</w:t>
-      </w:r>
-      <w:proofErr w:type="spellEnd"/>
-      <w:r>
-        <w:rPr>
-          <w:rFonts w:ascii="Menlo" w:hAnsi="Menlo" w:cs="Menlo"/>
-        </w:rPr>
-        <w:t xml:space="preserve">&gt;’ </w:t>
+        <w:t xml:space="preserve"> WITH NODE = ‘&lt;nodeName&gt;’ </w:t>
       </w:r>
       <w:r>
         <w:rPr>
@@ -635,33 +546,11 @@
       <w:r>
         <w:tab/>
       </w:r>
-      <w:proofErr w:type="spellStart"/>
-      <w:r>
-        <w:rPr>
-          <w:rFonts w:ascii="Menlo" w:hAnsi="Menlo" w:cs="Menlo"/>
-        </w:rPr>
-        <w:t>ld</w:t>
-      </w:r>
-      <w:proofErr w:type="spellEnd"/>
-      <w:r>
-        <w:rPr>
-          <w:rFonts w:ascii="Menlo" w:hAnsi="Menlo" w:cs="Menlo"/>
-        </w:rPr>
-        <w:t xml:space="preserve"> &lt;</w:t>
-      </w:r>
-      <w:proofErr w:type="spellStart"/>
-      <w:r>
-        <w:rPr>
-          <w:rFonts w:ascii="Menlo" w:hAnsi="Menlo" w:cs="Menlo"/>
-        </w:rPr>
-        <w:t>tableName</w:t>
-      </w:r>
-      <w:proofErr w:type="spellEnd"/>
-      <w:r>
-        <w:rPr>
-          <w:rFonts w:ascii="Menlo" w:hAnsi="Menlo" w:cs="Menlo"/>
-        </w:rPr>
-        <w:t>&gt; “&lt;filename&gt;”</w:t>
+      <w:r>
+        <w:rPr>
+          <w:rFonts w:ascii="Menlo" w:hAnsi="Menlo" w:cs="Menlo"/>
+        </w:rPr>
+        <w:t>ld &lt;tableName&gt; “&lt;filename&gt;”</w:t>
       </w:r>
     </w:p>
     <w:p>
@@ -675,14 +564,7 @@
         <w:rPr>
           <w:rFonts w:ascii="Menlo" w:hAnsi="Menlo" w:cs="Menlo"/>
         </w:rPr>
-        <w:t>[ TERMINATOR “&lt;char</w:t>
-      </w:r>
-      <w:proofErr w:type="gramStart"/>
-      <w:r>
-        <w:rPr>
-          <w:rFonts w:ascii="Menlo" w:hAnsi="Menlo" w:cs="Menlo"/>
-        </w:rPr>
-        <w:t xml:space="preserve">&gt;” </w:t>
+        <w:t xml:space="preserve">[ TERMINATOR “&lt;char&gt;” </w:t>
       </w:r>
       <w:r>
         <w:rPr>
@@ -694,14 +576,7 @@
         <w:rPr>
           <w:rFonts w:ascii="Menlo" w:hAnsi="Menlo" w:cs="Menlo"/>
         </w:rPr>
-        <w:t>|</w:t>
-      </w:r>
-      <w:proofErr w:type="gramEnd"/>
-      <w:r>
-        <w:rPr>
-          <w:rFonts w:ascii="Menlo" w:hAnsi="Menlo" w:cs="Menlo"/>
-        </w:rPr>
-        <w:t xml:space="preserve"> “\0” ]</w:t>
+        <w:t>| “\0” ]</w:t>
       </w:r>
     </w:p>
     <w:p>
@@ -715,14 +590,7 @@
         <w:rPr>
           <w:rFonts w:ascii="Menlo" w:hAnsi="Menlo" w:cs="Menlo"/>
         </w:rPr>
-        <w:t>[ DELIMITER “&lt;char</w:t>
-      </w:r>
-      <w:proofErr w:type="gramStart"/>
-      <w:r>
-        <w:rPr>
-          <w:rFonts w:ascii="Menlo" w:hAnsi="Menlo" w:cs="Menlo"/>
-        </w:rPr>
-        <w:t xml:space="preserve">&gt;” </w:t>
+        <w:t xml:space="preserve">[ DELIMITER “&lt;char&gt;” </w:t>
       </w:r>
       <w:r>
         <w:rPr>
@@ -730,7 +598,6 @@
         </w:rPr>
         <w:t xml:space="preserve">  </w:t>
       </w:r>
-      <w:proofErr w:type="gramEnd"/>
       <w:r>
         <w:rPr>
           <w:rFonts w:ascii="Menlo" w:hAnsi="Menlo" w:cs="Menlo"/>
@@ -749,14 +616,7 @@
         <w:rPr>
           <w:rFonts w:ascii="Menlo" w:hAnsi="Menlo" w:cs="Menlo"/>
         </w:rPr>
-        <w:t>[ ENCLOSED_BY “&lt;char&gt;” | “\0</w:t>
-      </w:r>
-      <w:proofErr w:type="gramStart"/>
-      <w:r>
-        <w:rPr>
-          <w:rFonts w:ascii="Menlo" w:hAnsi="Menlo" w:cs="Menlo"/>
-        </w:rPr>
-        <w:t>”</w:t>
+        <w:t>[ ENCLOSED_BY “&lt;char&gt;” | “\0”</w:t>
       </w:r>
       <w:r>
         <w:rPr>
@@ -770,7 +630,6 @@
         </w:rPr>
         <w:t>]</w:t>
       </w:r>
-      <w:proofErr w:type="gramEnd"/>
     </w:p>
     <w:p>
       <w:pPr>
@@ -783,16 +642,8 @@
         <w:rPr>
           <w:rFonts w:ascii="Menlo" w:hAnsi="Menlo" w:cs="Menlo"/>
         </w:rPr>
-        <w:t>[ ESCAPE_CHAR “&lt;char&gt;” | “\0</w:t>
-      </w:r>
-      <w:proofErr w:type="gramStart"/>
-      <w:r>
-        <w:rPr>
-          <w:rFonts w:ascii="Menlo" w:hAnsi="Menlo" w:cs="Menlo"/>
-        </w:rPr>
-        <w:t>” ]</w:t>
-      </w:r>
-      <w:proofErr w:type="gramEnd"/>
+        <w:t>[ ESCAPE_CHAR “&lt;char&gt;” | “\0” ]</w:t>
+      </w:r>
     </w:p>
     <w:p>
       <w:pPr>
@@ -873,34 +724,21 @@
         <w:t xml:space="preserve">  </w:t>
       </w:r>
       <w:r>
-        <w:rPr>
-          <w:highlight w:val="yellow"/>
-        </w:rPr>
-        <w:t xml:space="preserve">Otherwise the error </w:t>
-      </w:r>
-      <w:r>
-        <w:rPr>
-          <w:highlight w:val="yellow"/>
-        </w:rPr>
-        <w:t>‘</w:t>
-      </w:r>
-      <w:r>
-        <w:rPr>
-          <w:highlight w:val="yellow"/>
-        </w:rPr>
-        <w:t>xyz</w:t>
-      </w:r>
-      <w:r>
-        <w:rPr>
-          <w:highlight w:val="yellow"/>
-        </w:rPr>
-        <w:t>’</w:t>
-      </w:r>
-      <w:r>
-        <w:rPr>
-          <w:highlight w:val="yellow"/>
-        </w:rPr>
-        <w:t xml:space="preserve"> is reported</w:t>
+        <w:t>Otherwise the error ‘</w:t>
+      </w:r>
+      <w:r>
+        <w:t>t</w:t>
+      </w:r>
+      <w:bookmarkStart w:id="0" w:name="_GoBack"/>
+      <w:bookmarkEnd w:id="0"/>
+      <w:r>
+        <w:t xml:space="preserve">able </w:t>
+      </w:r>
+      <w:r>
+        <w:t>not empty</w:t>
+      </w:r>
+      <w:r>
+        <w:t>’ is reported</w:t>
       </w:r>
       <w:r>
         <w:t>.</w:t>
@@ -1117,15 +955,7 @@
         <w:t>looking</w:t>
       </w:r>
       <w:r>
-        <w:t xml:space="preserve"> at the </w:t>
-      </w:r>
-      <w:proofErr w:type="spellStart"/>
-      <w:r>
-        <w:t>nohupSE.out</w:t>
-      </w:r>
-      <w:proofErr w:type="spellEnd"/>
-      <w:r>
-        <w:t xml:space="preserve"> file on the loading node</w:t>
+        <w:t xml:space="preserve"> at the nohupSE.out file on the loading node</w:t>
       </w:r>
       <w:r>
         <w:t>.</w:t>

</xml_diff>

<commit_message>
modified the checkin no in checkinReport.
Former-commit-id: 771da271d89a16d09a975c0c6723b7140e532b6f
</commit_message>
<xml_diff>
--- a/Checkins/CheckinReport CSV Parsing.docx
+++ b/Checkins/CheckinReport CSV Parsing.docx
@@ -40,14 +40,10 @@
         <w:t xml:space="preserve">CHECK-IN/HASH (from bitbucket.org) </w:t>
       </w:r>
       <w:r>
-        <w:t>0</w:t>
-      </w:r>
-      <w:r>
-        <w:t>b</w:t>
-      </w:r>
-      <w:r>
-        <w:t>69708</w:t>
-      </w:r>
+        <w:t>3eaacc8</w:t>
+      </w:r>
+      <w:bookmarkStart w:id="0" w:name="_GoBack"/>
+      <w:bookmarkEnd w:id="0"/>
     </w:p>
     <w:p/>
     <w:p/>
@@ -343,7 +339,21 @@
         <w:rPr>
           <w:rFonts w:ascii="Menlo" w:hAnsi="Menlo" w:cs="Menlo"/>
         </w:rPr>
-        <w:t xml:space="preserve"> &lt;connectorName&gt;</w:t>
+        <w:t xml:space="preserve"> &lt;</w:t>
+      </w:r>
+      <w:proofErr w:type="spellStart"/>
+      <w:r>
+        <w:rPr>
+          <w:rFonts w:ascii="Menlo" w:hAnsi="Menlo" w:cs="Menlo"/>
+        </w:rPr>
+        <w:t>connectorName</w:t>
+      </w:r>
+      <w:proofErr w:type="spellEnd"/>
+      <w:r>
+        <w:rPr>
+          <w:rFonts w:ascii="Menlo" w:hAnsi="Menlo" w:cs="Menlo"/>
+        </w:rPr>
+        <w:t>&gt;</w:t>
       </w:r>
       <w:r>
         <w:rPr>
@@ -361,7 +371,21 @@
         <w:rPr>
           <w:rFonts w:ascii="Menlo" w:hAnsi="Menlo" w:cs="Menlo"/>
         </w:rPr>
-        <w:t xml:space="preserve">d &lt;tableName&gt; &lt;filename&gt; </w:t>
+        <w:t>d &lt;</w:t>
+      </w:r>
+      <w:proofErr w:type="spellStart"/>
+      <w:r>
+        <w:rPr>
+          <w:rFonts w:ascii="Menlo" w:hAnsi="Menlo" w:cs="Menlo"/>
+        </w:rPr>
+        <w:t>tableName</w:t>
+      </w:r>
+      <w:proofErr w:type="spellEnd"/>
+      <w:r>
+        <w:rPr>
+          <w:rFonts w:ascii="Menlo" w:hAnsi="Menlo" w:cs="Menlo"/>
+        </w:rPr>
+        <w:t xml:space="preserve">&gt; &lt;filename&gt; </w:t>
       </w:r>
     </w:p>
     <w:p>
@@ -393,7 +417,14 @@
         <w:rPr>
           <w:rFonts w:ascii="Menlo" w:hAnsi="Menlo" w:cs="Menlo"/>
         </w:rPr>
-        <w:t xml:space="preserve">&lt;char&gt; </w:t>
+        <w:t>&lt;char</w:t>
+      </w:r>
+      <w:proofErr w:type="gramStart"/>
+      <w:r>
+        <w:rPr>
+          <w:rFonts w:ascii="Menlo" w:hAnsi="Menlo" w:cs="Menlo"/>
+        </w:rPr>
+        <w:t xml:space="preserve">&gt; </w:t>
       </w:r>
       <w:r>
         <w:rPr>
@@ -405,7 +436,14 @@
         <w:rPr>
           <w:rFonts w:ascii="Menlo" w:hAnsi="Menlo" w:cs="Menlo"/>
         </w:rPr>
-        <w:t>| none ]</w:t>
+        <w:t>|</w:t>
+      </w:r>
+      <w:proofErr w:type="gramEnd"/>
+      <w:r>
+        <w:rPr>
+          <w:rFonts w:ascii="Menlo" w:hAnsi="Menlo" w:cs="Menlo"/>
+        </w:rPr>
+        <w:t xml:space="preserve"> none ]</w:t>
       </w:r>
     </w:p>
     <w:p>
@@ -443,8 +481,16 @@
         <w:rPr>
           <w:rFonts w:ascii="Menlo" w:hAnsi="Menlo" w:cs="Menlo"/>
         </w:rPr>
-        <w:t>| none ]</w:t>
-      </w:r>
+        <w:t xml:space="preserve">| </w:t>
+      </w:r>
+      <w:proofErr w:type="gramStart"/>
+      <w:r>
+        <w:rPr>
+          <w:rFonts w:ascii="Menlo" w:hAnsi="Menlo" w:cs="Menlo"/>
+        </w:rPr>
+        <w:t>none ]</w:t>
+      </w:r>
+      <w:proofErr w:type="gramEnd"/>
     </w:p>
     <w:p>
       <w:pPr>
@@ -475,8 +521,16 @@
         <w:rPr>
           <w:rFonts w:ascii="Menlo" w:hAnsi="Menlo" w:cs="Menlo"/>
         </w:rPr>
-        <w:t xml:space="preserve"> &lt;char&gt; | none ]</w:t>
-      </w:r>
+        <w:t xml:space="preserve"> &lt;char&gt; | </w:t>
+      </w:r>
+      <w:proofErr w:type="gramStart"/>
+      <w:r>
+        <w:rPr>
+          <w:rFonts w:ascii="Menlo" w:hAnsi="Menlo" w:cs="Menlo"/>
+        </w:rPr>
+        <w:t>none ]</w:t>
+      </w:r>
+      <w:proofErr w:type="gramEnd"/>
     </w:p>
     <w:p>
       <w:pPr>
@@ -495,8 +549,16 @@
         <w:rPr>
           <w:rFonts w:ascii="Menlo" w:hAnsi="Menlo" w:cs="Menlo"/>
         </w:rPr>
-        <w:t xml:space="preserve"> &lt;char&gt; | none ]</w:t>
-      </w:r>
+        <w:t xml:space="preserve"> &lt;char&gt; | </w:t>
+      </w:r>
+      <w:proofErr w:type="gramStart"/>
+      <w:r>
+        <w:rPr>
+          <w:rFonts w:ascii="Menlo" w:hAnsi="Menlo" w:cs="Menlo"/>
+        </w:rPr>
+        <w:t>none ]</w:t>
+      </w:r>
+      <w:proofErr w:type="gramEnd"/>
     </w:p>
     <w:p>
       <w:pPr>
@@ -505,6 +567,7 @@
           <w:rFonts w:ascii="Menlo" w:hAnsi="Menlo" w:cs="Menlo"/>
         </w:rPr>
       </w:pPr>
+      <w:proofErr w:type="gramStart"/>
       <w:r>
         <w:rPr>
           <w:rFonts w:ascii="Menlo" w:hAnsi="Menlo" w:cs="Menlo"/>
@@ -515,7 +578,28 @@
         <w:rPr>
           <w:rFonts w:ascii="Menlo" w:hAnsi="Menlo" w:cs="Menlo"/>
         </w:rPr>
-        <w:t xml:space="preserve"> WITH NODE = ‘&lt;nodeName&gt;’ </w:t>
+        <w:t xml:space="preserve"> WITH</w:t>
+      </w:r>
+      <w:proofErr w:type="gramEnd"/>
+      <w:r>
+        <w:rPr>
+          <w:rFonts w:ascii="Menlo" w:hAnsi="Menlo" w:cs="Menlo"/>
+        </w:rPr>
+        <w:t xml:space="preserve"> NODE = ‘&lt;</w:t>
+      </w:r>
+      <w:proofErr w:type="spellStart"/>
+      <w:r>
+        <w:rPr>
+          <w:rFonts w:ascii="Menlo" w:hAnsi="Menlo" w:cs="Menlo"/>
+        </w:rPr>
+        <w:t>nodeName</w:t>
+      </w:r>
+      <w:proofErr w:type="spellEnd"/>
+      <w:r>
+        <w:rPr>
+          <w:rFonts w:ascii="Menlo" w:hAnsi="Menlo" w:cs="Menlo"/>
+        </w:rPr>
+        <w:t xml:space="preserve">&gt;’ </w:t>
       </w:r>
       <w:r>
         <w:rPr>
@@ -546,11 +630,33 @@
       <w:r>
         <w:tab/>
       </w:r>
-      <w:r>
-        <w:rPr>
-          <w:rFonts w:ascii="Menlo" w:hAnsi="Menlo" w:cs="Menlo"/>
-        </w:rPr>
-        <w:t>ld &lt;tableName&gt; “&lt;filename&gt;”</w:t>
+      <w:proofErr w:type="spellStart"/>
+      <w:r>
+        <w:rPr>
+          <w:rFonts w:ascii="Menlo" w:hAnsi="Menlo" w:cs="Menlo"/>
+        </w:rPr>
+        <w:t>ld</w:t>
+      </w:r>
+      <w:proofErr w:type="spellEnd"/>
+      <w:r>
+        <w:rPr>
+          <w:rFonts w:ascii="Menlo" w:hAnsi="Menlo" w:cs="Menlo"/>
+        </w:rPr>
+        <w:t xml:space="preserve"> &lt;</w:t>
+      </w:r>
+      <w:proofErr w:type="spellStart"/>
+      <w:r>
+        <w:rPr>
+          <w:rFonts w:ascii="Menlo" w:hAnsi="Menlo" w:cs="Menlo"/>
+        </w:rPr>
+        <w:t>tableName</w:t>
+      </w:r>
+      <w:proofErr w:type="spellEnd"/>
+      <w:r>
+        <w:rPr>
+          <w:rFonts w:ascii="Menlo" w:hAnsi="Menlo" w:cs="Menlo"/>
+        </w:rPr>
+        <w:t>&gt; “&lt;filename&gt;”</w:t>
       </w:r>
     </w:p>
     <w:p>
@@ -564,7 +670,14 @@
         <w:rPr>
           <w:rFonts w:ascii="Menlo" w:hAnsi="Menlo" w:cs="Menlo"/>
         </w:rPr>
-        <w:t xml:space="preserve">[ TERMINATOR “&lt;char&gt;” </w:t>
+        <w:t>[ TERMINATOR “&lt;char</w:t>
+      </w:r>
+      <w:proofErr w:type="gramStart"/>
+      <w:r>
+        <w:rPr>
+          <w:rFonts w:ascii="Menlo" w:hAnsi="Menlo" w:cs="Menlo"/>
+        </w:rPr>
+        <w:t xml:space="preserve">&gt;” </w:t>
       </w:r>
       <w:r>
         <w:rPr>
@@ -576,6 +689,47 @@
         <w:rPr>
           <w:rFonts w:ascii="Menlo" w:hAnsi="Menlo" w:cs="Menlo"/>
         </w:rPr>
+        <w:t>|</w:t>
+      </w:r>
+      <w:proofErr w:type="gramEnd"/>
+      <w:r>
+        <w:rPr>
+          <w:rFonts w:ascii="Menlo" w:hAnsi="Menlo" w:cs="Menlo"/>
+        </w:rPr>
+        <w:t xml:space="preserve"> “\0” ]</w:t>
+      </w:r>
+    </w:p>
+    <w:p>
+      <w:pPr>
+        <w:ind w:left="720" w:firstLine="720"/>
+        <w:rPr>
+          <w:rFonts w:ascii="Menlo" w:hAnsi="Menlo" w:cs="Menlo"/>
+        </w:rPr>
+      </w:pPr>
+      <w:r>
+        <w:rPr>
+          <w:rFonts w:ascii="Menlo" w:hAnsi="Menlo" w:cs="Menlo"/>
+        </w:rPr>
+        <w:t>[ DELIMITER “&lt;char</w:t>
+      </w:r>
+      <w:proofErr w:type="gramStart"/>
+      <w:r>
+        <w:rPr>
+          <w:rFonts w:ascii="Menlo" w:hAnsi="Menlo" w:cs="Menlo"/>
+        </w:rPr>
+        <w:t xml:space="preserve">&gt;” </w:t>
+      </w:r>
+      <w:r>
+        <w:rPr>
+          <w:rFonts w:ascii="Menlo" w:hAnsi="Menlo" w:cs="Menlo"/>
+        </w:rPr>
+        <w:t xml:space="preserve">  </w:t>
+      </w:r>
+      <w:proofErr w:type="gramEnd"/>
+      <w:r>
+        <w:rPr>
+          <w:rFonts w:ascii="Menlo" w:hAnsi="Menlo" w:cs="Menlo"/>
+        </w:rPr>
         <w:t>| “\0” ]</w:t>
       </w:r>
     </w:p>
@@ -590,20 +744,28 @@
         <w:rPr>
           <w:rFonts w:ascii="Menlo" w:hAnsi="Menlo" w:cs="Menlo"/>
         </w:rPr>
-        <w:t xml:space="preserve">[ DELIMITER “&lt;char&gt;” </w:t>
-      </w:r>
-      <w:r>
-        <w:rPr>
-          <w:rFonts w:ascii="Menlo" w:hAnsi="Menlo" w:cs="Menlo"/>
-        </w:rPr>
-        <w:t xml:space="preserve">  </w:t>
-      </w:r>
-      <w:r>
-        <w:rPr>
-          <w:rFonts w:ascii="Menlo" w:hAnsi="Menlo" w:cs="Menlo"/>
-        </w:rPr>
-        <w:t>| “\0” ]</w:t>
-      </w:r>
+        <w:t>[ ENCLOSED_BY “&lt;char&gt;” | “\0</w:t>
+      </w:r>
+      <w:proofErr w:type="gramStart"/>
+      <w:r>
+        <w:rPr>
+          <w:rFonts w:ascii="Menlo" w:hAnsi="Menlo" w:cs="Menlo"/>
+        </w:rPr>
+        <w:t>”</w:t>
+      </w:r>
+      <w:r>
+        <w:rPr>
+          <w:rFonts w:ascii="Menlo" w:hAnsi="Menlo" w:cs="Menlo"/>
+        </w:rPr>
+        <w:t xml:space="preserve"> </w:t>
+      </w:r>
+      <w:r>
+        <w:rPr>
+          <w:rFonts w:ascii="Menlo" w:hAnsi="Menlo" w:cs="Menlo"/>
+        </w:rPr>
+        <w:t>]</w:t>
+      </w:r>
+      <w:proofErr w:type="gramEnd"/>
     </w:p>
     <w:p>
       <w:pPr>
@@ -616,34 +778,16 @@
         <w:rPr>
           <w:rFonts w:ascii="Menlo" w:hAnsi="Menlo" w:cs="Menlo"/>
         </w:rPr>
-        <w:t>[ ENCLOSED_BY “&lt;char&gt;” | “\0”</w:t>
-      </w:r>
-      <w:r>
-        <w:rPr>
-          <w:rFonts w:ascii="Menlo" w:hAnsi="Menlo" w:cs="Menlo"/>
-        </w:rPr>
-        <w:t xml:space="preserve"> </w:t>
-      </w:r>
-      <w:r>
-        <w:rPr>
-          <w:rFonts w:ascii="Menlo" w:hAnsi="Menlo" w:cs="Menlo"/>
-        </w:rPr>
-        <w:t>]</w:t>
-      </w:r>
-    </w:p>
-    <w:p>
-      <w:pPr>
-        <w:ind w:left="720" w:firstLine="720"/>
-        <w:rPr>
-          <w:rFonts w:ascii="Menlo" w:hAnsi="Menlo" w:cs="Menlo"/>
-        </w:rPr>
-      </w:pPr>
-      <w:r>
-        <w:rPr>
-          <w:rFonts w:ascii="Menlo" w:hAnsi="Menlo" w:cs="Menlo"/>
-        </w:rPr>
-        <w:t>[ ESCAPE_CHAR “&lt;char&gt;” | “\0” ]</w:t>
-      </w:r>
+        <w:t>[ ESCAPE_CHAR “&lt;char&gt;” | “\0</w:t>
+      </w:r>
+      <w:proofErr w:type="gramStart"/>
+      <w:r>
+        <w:rPr>
+          <w:rFonts w:ascii="Menlo" w:hAnsi="Menlo" w:cs="Menlo"/>
+        </w:rPr>
+        <w:t>” ]</w:t>
+      </w:r>
+      <w:proofErr w:type="gramEnd"/>
     </w:p>
     <w:p>
       <w:pPr>
@@ -953,12 +1097,18 @@
         <w:t>looking</w:t>
       </w:r>
       <w:r>
-        <w:t xml:space="preserve"> at the nohup</w:t>
-      </w:r>
-      <w:bookmarkStart w:id="0" w:name="_GoBack"/>
-      <w:bookmarkEnd w:id="0"/>
-      <w:r>
-        <w:t>.out file on the loading node</w:t>
+        <w:t xml:space="preserve"> at the </w:t>
+      </w:r>
+      <w:proofErr w:type="spellStart"/>
+      <w:r>
+        <w:t>nohup</w:t>
+      </w:r>
+      <w:r>
+        <w:t>.out</w:t>
+      </w:r>
+      <w:proofErr w:type="spellEnd"/>
+      <w:r>
+        <w:t xml:space="preserve"> file on the loading node</w:t>
       </w:r>
       <w:r>
         <w:t>.</w:t>

</xml_diff>

<commit_message>
Modified LoadMap::bFindChunk() to search for both \r or \n as record end
Former-commit-id: 9bed91de69c9867a4b98f1484c8b64e84fe502b9
</commit_message>
<xml_diff>
--- a/Checkins/CheckinReport CSV Parsing.docx
+++ b/Checkins/CheckinReport CSV Parsing.docx
@@ -7,7 +7,10 @@
         <w:t xml:space="preserve">DATE:  </w:t>
       </w:r>
       <w:r>
-        <w:t>Dec 18</w:t>
+        <w:t xml:space="preserve">Dec </w:t>
+      </w:r>
+      <w:r>
+        <w:t>22</w:t>
       </w:r>
       <w:r>
         <w:t>,</w:t>
@@ -40,10 +43,8 @@
         <w:t xml:space="preserve">CHECK-IN/HASH (from bitbucket.org) </w:t>
       </w:r>
       <w:r>
-        <w:t>3eaacc8</w:t>
-      </w:r>
-      <w:bookmarkStart w:id="0" w:name="_GoBack"/>
-      <w:bookmarkEnd w:id="0"/>
+        <w:t>0405b85</w:t>
+      </w:r>
     </w:p>
     <w:p/>
     <w:p/>
@@ -63,13 +64,13 @@
       <w:tblPr>
         <w:tblStyle w:val="TableGrid"/>
         <w:tblpPr w:leftFromText="180" w:rightFromText="180" w:vertAnchor="page" w:horzAnchor="margin" w:tblpY="4177"/>
-        <w:tblW w:w="9828" w:type="dxa"/>
+        <w:tblW w:w="9747" w:type="dxa"/>
         <w:tblLook w:val="04A0" w:firstRow="1" w:lastRow="0" w:firstColumn="1" w:lastColumn="0" w:noHBand="0" w:noVBand="1"/>
       </w:tblPr>
       <w:tblGrid>
         <w:gridCol w:w="1101"/>
         <w:gridCol w:w="4536"/>
-        <w:gridCol w:w="4191"/>
+        <w:gridCol w:w="4110"/>
       </w:tblGrid>
       <w:tr>
         <w:tc>
@@ -94,7 +95,7 @@
         </w:tc>
         <w:tc>
           <w:tcPr>
-            <w:tcW w:w="4191" w:type="dxa"/>
+            <w:tcW w:w="4110" w:type="dxa"/>
           </w:tcPr>
           <w:p>
             <w:r>
@@ -135,7 +136,7 @@
         </w:tc>
         <w:tc>
           <w:tcPr>
-            <w:tcW w:w="4191" w:type="dxa"/>
+            <w:tcW w:w="4110" w:type="dxa"/>
           </w:tcPr>
           <w:p>
             <w:r>
@@ -173,7 +174,7 @@
         </w:tc>
         <w:tc>
           <w:tcPr>
-            <w:tcW w:w="4191" w:type="dxa"/>
+            <w:tcW w:w="4110" w:type="dxa"/>
           </w:tcPr>
           <w:p>
             <w:r>
@@ -214,7 +215,7 @@
         </w:tc>
         <w:tc>
           <w:tcPr>
-            <w:tcW w:w="4191" w:type="dxa"/>
+            <w:tcW w:w="4110" w:type="dxa"/>
           </w:tcPr>
           <w:p>
             <w:r>
@@ -228,19 +229,167 @@
           <w:tcPr>
             <w:tcW w:w="1101" w:type="dxa"/>
           </w:tcPr>
-          <w:p/>
+          <w:p>
+            <w:r>
+              <w:t>239</w:t>
+            </w:r>
+          </w:p>
         </w:tc>
         <w:tc>
           <w:tcPr>
             <w:tcW w:w="4536" w:type="dxa"/>
           </w:tcPr>
-          <w:p/>
-        </w:tc>
-        <w:tc>
-          <w:tcPr>
-            <w:tcW w:w="4191" w:type="dxa"/>
-          </w:tcPr>
-          <w:p/>
+          <w:p>
+            <w:r>
+              <w:t>Escaping of delimiter</w:t>
+            </w:r>
+          </w:p>
+        </w:tc>
+        <w:tc>
+          <w:tcPr>
+            <w:tcW w:w="4110" w:type="dxa"/>
+          </w:tcPr>
+          <w:p>
+            <w:r>
+              <w:t>Test the escape of delimiters</w:t>
+            </w:r>
+          </w:p>
+        </w:tc>
+      </w:tr>
+      <w:tr>
+        <w:tc>
+          <w:tcPr>
+            <w:tcW w:w="1101" w:type="dxa"/>
+          </w:tcPr>
+          <w:p>
+            <w:r>
+              <w:t>240</w:t>
+            </w:r>
+          </w:p>
+        </w:tc>
+        <w:tc>
+          <w:tcPr>
+            <w:tcW w:w="4536" w:type="dxa"/>
+          </w:tcPr>
+          <w:p>
+            <w:r>
+              <w:t>File name in load exception</w:t>
+            </w:r>
+          </w:p>
+        </w:tc>
+        <w:tc>
+          <w:tcPr>
+            <w:tcW w:w="4110" w:type="dxa"/>
+          </w:tcPr>
+          <w:p>
+            <w:r>
+              <w:t>File name should be nohupSE.out</w:t>
+            </w:r>
+          </w:p>
+        </w:tc>
+      </w:tr>
+      <w:tr>
+        <w:tc>
+          <w:tcPr>
+            <w:tcW w:w="1101" w:type="dxa"/>
+          </w:tcPr>
+          <w:p>
+            <w:r>
+              <w:t>241</w:t>
+            </w:r>
+          </w:p>
+        </w:tc>
+        <w:tc>
+          <w:tcPr>
+            <w:tcW w:w="4536" w:type="dxa"/>
+          </w:tcPr>
+          <w:p>
+            <w:r>
+              <w:t>Nohup.out had messages without timestamps</w:t>
+            </w:r>
+          </w:p>
+        </w:tc>
+        <w:tc>
+          <w:tcPr>
+            <w:tcW w:w="4110" w:type="dxa"/>
+          </w:tcPr>
+          <w:p>
+            <w:r>
+              <w:t>Observe that the messages have been removed</w:t>
+            </w:r>
+          </w:p>
+        </w:tc>
+      </w:tr>
+      <w:tr>
+        <w:tc>
+          <w:tcPr>
+            <w:tcW w:w="1101" w:type="dxa"/>
+          </w:tcPr>
+          <w:p>
+            <w:r>
+              <w:t>242</w:t>
+            </w:r>
+          </w:p>
+        </w:tc>
+        <w:tc>
+          <w:tcPr>
+            <w:tcW w:w="4536" w:type="dxa"/>
+          </w:tcPr>
+          <w:p>
+            <w:r>
+              <w:t>Missing terminator on last line</w:t>
+            </w:r>
+          </w:p>
+        </w:tc>
+        <w:tc>
+          <w:tcPr>
+            <w:tcW w:w="4110" w:type="dxa"/>
+          </w:tcPr>
+          <w:p>
+            <w:r>
+              <w:t>Test records with/without terminators</w:t>
+            </w:r>
+          </w:p>
+        </w:tc>
+      </w:tr>
+      <w:tr>
+        <w:tc>
+          <w:tcPr>
+            <w:tcW w:w="1101" w:type="dxa"/>
+          </w:tcPr>
+          <w:p>
+            <w:r>
+              <w:t>243</w:t>
+            </w:r>
+          </w:p>
+        </w:tc>
+        <w:tc>
+          <w:tcPr>
+            <w:tcW w:w="4536" w:type="dxa"/>
+          </w:tcPr>
+          <w:p>
+            <w:r>
+              <w:t>Nothing</w:t>
+            </w:r>
+          </w:p>
+        </w:tc>
+        <w:tc>
+          <w:tcPr>
+            <w:tcW w:w="4110" w:type="dxa"/>
+          </w:tcPr>
+          <w:p>
+            <w:r>
+              <w:t xml:space="preserve">An explanation </w:t>
+            </w:r>
+            <w:r>
+              <w:t xml:space="preserve">as to terminators </w:t>
+            </w:r>
+            <w:bookmarkStart w:id="0" w:name="_GoBack"/>
+            <w:bookmarkEnd w:id="0"/>
+            <w:r>
+              <w:t>is provided below in Additional Information</w:t>
+            </w:r>
+          </w:p>
         </w:tc>
       </w:tr>
     </w:tbl>
@@ -339,21 +488,7 @@
         <w:rPr>
           <w:rFonts w:ascii="Menlo" w:hAnsi="Menlo" w:cs="Menlo"/>
         </w:rPr>
-        <w:t xml:space="preserve"> &lt;</w:t>
-      </w:r>
-      <w:proofErr w:type="spellStart"/>
-      <w:r>
-        <w:rPr>
-          <w:rFonts w:ascii="Menlo" w:hAnsi="Menlo" w:cs="Menlo"/>
-        </w:rPr>
-        <w:t>connectorName</w:t>
-      </w:r>
-      <w:proofErr w:type="spellEnd"/>
-      <w:r>
-        <w:rPr>
-          <w:rFonts w:ascii="Menlo" w:hAnsi="Menlo" w:cs="Menlo"/>
-        </w:rPr>
-        <w:t>&gt;</w:t>
+        <w:t xml:space="preserve"> &lt;connectorName&gt;</w:t>
       </w:r>
       <w:r>
         <w:rPr>
@@ -371,21 +506,7 @@
         <w:rPr>
           <w:rFonts w:ascii="Menlo" w:hAnsi="Menlo" w:cs="Menlo"/>
         </w:rPr>
-        <w:t>d &lt;</w:t>
-      </w:r>
-      <w:proofErr w:type="spellStart"/>
-      <w:r>
-        <w:rPr>
-          <w:rFonts w:ascii="Menlo" w:hAnsi="Menlo" w:cs="Menlo"/>
-        </w:rPr>
-        <w:t>tableName</w:t>
-      </w:r>
-      <w:proofErr w:type="spellEnd"/>
-      <w:r>
-        <w:rPr>
-          <w:rFonts w:ascii="Menlo" w:hAnsi="Menlo" w:cs="Menlo"/>
-        </w:rPr>
-        <w:t xml:space="preserve">&gt; &lt;filename&gt; </w:t>
+        <w:t xml:space="preserve">d &lt;tableName&gt; &lt;filename&gt; </w:t>
       </w:r>
     </w:p>
     <w:p>
@@ -417,14 +538,7 @@
         <w:rPr>
           <w:rFonts w:ascii="Menlo" w:hAnsi="Menlo" w:cs="Menlo"/>
         </w:rPr>
-        <w:t>&lt;char</w:t>
-      </w:r>
-      <w:proofErr w:type="gramStart"/>
-      <w:r>
-        <w:rPr>
-          <w:rFonts w:ascii="Menlo" w:hAnsi="Menlo" w:cs="Menlo"/>
-        </w:rPr>
-        <w:t xml:space="preserve">&gt; </w:t>
+        <w:t xml:space="preserve">&lt;char&gt; </w:t>
       </w:r>
       <w:r>
         <w:rPr>
@@ -436,14 +550,7 @@
         <w:rPr>
           <w:rFonts w:ascii="Menlo" w:hAnsi="Menlo" w:cs="Menlo"/>
         </w:rPr>
-        <w:t>|</w:t>
-      </w:r>
-      <w:proofErr w:type="gramEnd"/>
-      <w:r>
-        <w:rPr>
-          <w:rFonts w:ascii="Menlo" w:hAnsi="Menlo" w:cs="Menlo"/>
-        </w:rPr>
-        <w:t xml:space="preserve"> none ]</w:t>
+        <w:t>| none ]</w:t>
       </w:r>
     </w:p>
     <w:p>
@@ -481,16 +588,8 @@
         <w:rPr>
           <w:rFonts w:ascii="Menlo" w:hAnsi="Menlo" w:cs="Menlo"/>
         </w:rPr>
-        <w:t xml:space="preserve">| </w:t>
-      </w:r>
-      <w:proofErr w:type="gramStart"/>
-      <w:r>
-        <w:rPr>
-          <w:rFonts w:ascii="Menlo" w:hAnsi="Menlo" w:cs="Menlo"/>
-        </w:rPr>
-        <w:t>none ]</w:t>
-      </w:r>
-      <w:proofErr w:type="gramEnd"/>
+        <w:t>| none ]</w:t>
+      </w:r>
     </w:p>
     <w:p>
       <w:pPr>
@@ -521,16 +620,8 @@
         <w:rPr>
           <w:rFonts w:ascii="Menlo" w:hAnsi="Menlo" w:cs="Menlo"/>
         </w:rPr>
-        <w:t xml:space="preserve"> &lt;char&gt; | </w:t>
-      </w:r>
-      <w:proofErr w:type="gramStart"/>
-      <w:r>
-        <w:rPr>
-          <w:rFonts w:ascii="Menlo" w:hAnsi="Menlo" w:cs="Menlo"/>
-        </w:rPr>
-        <w:t>none ]</w:t>
-      </w:r>
-      <w:proofErr w:type="gramEnd"/>
+        <w:t xml:space="preserve"> &lt;char&gt; | none ]</w:t>
+      </w:r>
     </w:p>
     <w:p>
       <w:pPr>
@@ -549,16 +640,8 @@
         <w:rPr>
           <w:rFonts w:ascii="Menlo" w:hAnsi="Menlo" w:cs="Menlo"/>
         </w:rPr>
-        <w:t xml:space="preserve"> &lt;char&gt; | </w:t>
-      </w:r>
-      <w:proofErr w:type="gramStart"/>
-      <w:r>
-        <w:rPr>
-          <w:rFonts w:ascii="Menlo" w:hAnsi="Menlo" w:cs="Menlo"/>
-        </w:rPr>
-        <w:t>none ]</w:t>
-      </w:r>
-      <w:proofErr w:type="gramEnd"/>
+        <w:t xml:space="preserve"> &lt;char&gt; | none ]</w:t>
+      </w:r>
     </w:p>
     <w:p>
       <w:pPr>
@@ -567,7 +650,6 @@
           <w:rFonts w:ascii="Menlo" w:hAnsi="Menlo" w:cs="Menlo"/>
         </w:rPr>
       </w:pPr>
-      <w:proofErr w:type="gramStart"/>
       <w:r>
         <w:rPr>
           <w:rFonts w:ascii="Menlo" w:hAnsi="Menlo" w:cs="Menlo"/>
@@ -578,28 +660,7 @@
         <w:rPr>
           <w:rFonts w:ascii="Menlo" w:hAnsi="Menlo" w:cs="Menlo"/>
         </w:rPr>
-        <w:t xml:space="preserve"> WITH</w:t>
-      </w:r>
-      <w:proofErr w:type="gramEnd"/>
-      <w:r>
-        <w:rPr>
-          <w:rFonts w:ascii="Menlo" w:hAnsi="Menlo" w:cs="Menlo"/>
-        </w:rPr>
-        <w:t xml:space="preserve"> NODE = ‘&lt;</w:t>
-      </w:r>
-      <w:proofErr w:type="spellStart"/>
-      <w:r>
-        <w:rPr>
-          <w:rFonts w:ascii="Menlo" w:hAnsi="Menlo" w:cs="Menlo"/>
-        </w:rPr>
-        <w:t>nodeName</w:t>
-      </w:r>
-      <w:proofErr w:type="spellEnd"/>
-      <w:r>
-        <w:rPr>
-          <w:rFonts w:ascii="Menlo" w:hAnsi="Menlo" w:cs="Menlo"/>
-        </w:rPr>
-        <w:t xml:space="preserve">&gt;’ </w:t>
+        <w:t xml:space="preserve"> WITH NODE = ‘&lt;nodeName&gt;’ </w:t>
       </w:r>
       <w:r>
         <w:rPr>
@@ -630,33 +691,11 @@
       <w:r>
         <w:tab/>
       </w:r>
-      <w:proofErr w:type="spellStart"/>
-      <w:r>
-        <w:rPr>
-          <w:rFonts w:ascii="Menlo" w:hAnsi="Menlo" w:cs="Menlo"/>
-        </w:rPr>
-        <w:t>ld</w:t>
-      </w:r>
-      <w:proofErr w:type="spellEnd"/>
-      <w:r>
-        <w:rPr>
-          <w:rFonts w:ascii="Menlo" w:hAnsi="Menlo" w:cs="Menlo"/>
-        </w:rPr>
-        <w:t xml:space="preserve"> &lt;</w:t>
-      </w:r>
-      <w:proofErr w:type="spellStart"/>
-      <w:r>
-        <w:rPr>
-          <w:rFonts w:ascii="Menlo" w:hAnsi="Menlo" w:cs="Menlo"/>
-        </w:rPr>
-        <w:t>tableName</w:t>
-      </w:r>
-      <w:proofErr w:type="spellEnd"/>
-      <w:r>
-        <w:rPr>
-          <w:rFonts w:ascii="Menlo" w:hAnsi="Menlo" w:cs="Menlo"/>
-        </w:rPr>
-        <w:t>&gt; “&lt;filename&gt;”</w:t>
+      <w:r>
+        <w:rPr>
+          <w:rFonts w:ascii="Menlo" w:hAnsi="Menlo" w:cs="Menlo"/>
+        </w:rPr>
+        <w:t>ld &lt;tableName&gt; “&lt;filename&gt;”</w:t>
       </w:r>
     </w:p>
     <w:p>
@@ -670,14 +709,7 @@
         <w:rPr>
           <w:rFonts w:ascii="Menlo" w:hAnsi="Menlo" w:cs="Menlo"/>
         </w:rPr>
-        <w:t>[ TERMINATOR “&lt;char</w:t>
-      </w:r>
-      <w:proofErr w:type="gramStart"/>
-      <w:r>
-        <w:rPr>
-          <w:rFonts w:ascii="Menlo" w:hAnsi="Menlo" w:cs="Menlo"/>
-        </w:rPr>
-        <w:t xml:space="preserve">&gt;” </w:t>
+        <w:t xml:space="preserve">[ TERMINATOR “&lt;char&gt;” </w:t>
       </w:r>
       <w:r>
         <w:rPr>
@@ -689,14 +721,7 @@
         <w:rPr>
           <w:rFonts w:ascii="Menlo" w:hAnsi="Menlo" w:cs="Menlo"/>
         </w:rPr>
-        <w:t>|</w:t>
-      </w:r>
-      <w:proofErr w:type="gramEnd"/>
-      <w:r>
-        <w:rPr>
-          <w:rFonts w:ascii="Menlo" w:hAnsi="Menlo" w:cs="Menlo"/>
-        </w:rPr>
-        <w:t xml:space="preserve"> “\0” ]</w:t>
+        <w:t>| “\0” ]</w:t>
       </w:r>
     </w:p>
     <w:p>
@@ -710,14 +735,7 @@
         <w:rPr>
           <w:rFonts w:ascii="Menlo" w:hAnsi="Menlo" w:cs="Menlo"/>
         </w:rPr>
-        <w:t>[ DELIMITER “&lt;char</w:t>
-      </w:r>
-      <w:proofErr w:type="gramStart"/>
-      <w:r>
-        <w:rPr>
-          <w:rFonts w:ascii="Menlo" w:hAnsi="Menlo" w:cs="Menlo"/>
-        </w:rPr>
-        <w:t xml:space="preserve">&gt;” </w:t>
+        <w:t xml:space="preserve">[ DELIMITER “&lt;char&gt;” </w:t>
       </w:r>
       <w:r>
         <w:rPr>
@@ -725,7 +743,6 @@
         </w:rPr>
         <w:t xml:space="preserve">  </w:t>
       </w:r>
-      <w:proofErr w:type="gramEnd"/>
       <w:r>
         <w:rPr>
           <w:rFonts w:ascii="Menlo" w:hAnsi="Menlo" w:cs="Menlo"/>
@@ -744,14 +761,7 @@
         <w:rPr>
           <w:rFonts w:ascii="Menlo" w:hAnsi="Menlo" w:cs="Menlo"/>
         </w:rPr>
-        <w:t>[ ENCLOSED_BY “&lt;char&gt;” | “\0</w:t>
-      </w:r>
-      <w:proofErr w:type="gramStart"/>
-      <w:r>
-        <w:rPr>
-          <w:rFonts w:ascii="Menlo" w:hAnsi="Menlo" w:cs="Menlo"/>
-        </w:rPr>
-        <w:t>”</w:t>
+        <w:t>[ ENCLOSED_BY “&lt;char&gt;” | “\0”</w:t>
       </w:r>
       <w:r>
         <w:rPr>
@@ -765,7 +775,6 @@
         </w:rPr>
         <w:t>]</w:t>
       </w:r>
-      <w:proofErr w:type="gramEnd"/>
     </w:p>
     <w:p>
       <w:pPr>
@@ -778,16 +787,8 @@
         <w:rPr>
           <w:rFonts w:ascii="Menlo" w:hAnsi="Menlo" w:cs="Menlo"/>
         </w:rPr>
-        <w:t>[ ESCAPE_CHAR “&lt;char&gt;” | “\0</w:t>
-      </w:r>
-      <w:proofErr w:type="gramStart"/>
-      <w:r>
-        <w:rPr>
-          <w:rFonts w:ascii="Menlo" w:hAnsi="Menlo" w:cs="Menlo"/>
-        </w:rPr>
-        <w:t>” ]</w:t>
-      </w:r>
-      <w:proofErr w:type="gramEnd"/>
+        <w:t>[ ESCAPE_CHAR “&lt;char&gt;” | “\0” ]</w:t>
+      </w:r>
     </w:p>
     <w:p>
       <w:pPr>
@@ -1097,18 +1098,10 @@
         <w:t>looking</w:t>
       </w:r>
       <w:r>
-        <w:t xml:space="preserve"> at the </w:t>
-      </w:r>
-      <w:proofErr w:type="spellStart"/>
-      <w:r>
-        <w:t>nohup</w:t>
-      </w:r>
-      <w:r>
-        <w:t>.out</w:t>
-      </w:r>
-      <w:proofErr w:type="spellEnd"/>
-      <w:r>
-        <w:t xml:space="preserve"> file on the loading node</w:t>
+        <w:t xml:space="preserve"> at the nohup</w:t>
+      </w:r>
+      <w:r>
+        <w:t>.out file on the loading node</w:t>
       </w:r>
       <w:r>
         <w:t>.</w:t>
@@ -1126,8 +1119,36 @@
         <w:t>The index limit per table has been increased to 1024.</w:t>
       </w:r>
     </w:p>
-    <w:p/>
-    <w:p/>
+    <w:p>
+      <w:pPr>
+        <w:pStyle w:val="ListParagraph"/>
+        <w:numPr>
+          <w:ilvl w:val="0"/>
+          <w:numId w:val="3"/>
+        </w:numPr>
+      </w:pPr>
+      <w:r>
+        <w:t xml:space="preserve">By </w:t>
+      </w:r>
+      <w:r>
+        <w:t>default,</w:t>
+      </w:r>
+      <w:r>
+        <w:t xml:space="preserve"> the SE loader automatically handles the following terminators:</w:t>
+      </w:r>
+      <w:r>
+        <w:br/>
+        <w:t>\n</w:t>
+      </w:r>
+      <w:r>
+        <w:br/>
+        <w:t>\r</w:t>
+      </w:r>
+      <w:r>
+        <w:br/>
+        <w:t>\r\n</w:t>
+      </w:r>
+    </w:p>
     <w:sectPr>
       <w:pgSz w:w="12240" w:h="15840"/>
       <w:pgMar w:top="1440" w:right="1440" w:bottom="1440" w:left="1440" w:header="720" w:footer="720" w:gutter="0"/>
@@ -1156,7 +1177,7 @@
         <w:rFonts w:hint="default"/>
       </w:rPr>
     </w:lvl>
-    <w:lvl w:ilvl="1" w:tplc="08090019" w:tentative="1">
+    <w:lvl w:ilvl="1" w:tplc="08090019">
       <w:start w:val="1"/>
       <w:numFmt w:val="lowerLetter"/>
       <w:lvlText w:val="%2."/>

</xml_diff>

<commit_message>
Todays release update in checkinReport.
Former-commit-id: 1cb25dba3cc1dfc075c58ed74cd72920648eba74
</commit_message>
<xml_diff>
--- a/Checkins/CheckinReport CSV Parsing.docx
+++ b/Checkins/CheckinReport CSV Parsing.docx
@@ -7,7 +7,12 @@
         <w:t xml:space="preserve">DATE:  </w:t>
       </w:r>
       <w:r>
-        <w:t xml:space="preserve">Dec </w:t>
+        <w:t>D</w:t>
+      </w:r>
+      <w:bookmarkStart w:id="0" w:name="_GoBack"/>
+      <w:bookmarkEnd w:id="0"/>
+      <w:r>
+        <w:t xml:space="preserve">ec </w:t>
       </w:r>
       <w:r>
         <w:t>22</w:t>
@@ -43,7 +48,7 @@
         <w:t xml:space="preserve">CHECK-IN/HASH (from bitbucket.org) </w:t>
       </w:r>
       <w:r>
-        <w:t>0405b85</w:t>
+        <w:t>b471157</w:t>
       </w:r>
     </w:p>
     <w:p/>
@@ -283,8 +288,13 @@
           </w:tcPr>
           <w:p>
             <w:r>
-              <w:t>File name should be nohupSE.out</w:t>
-            </w:r>
+              <w:t xml:space="preserve">File name should be </w:t>
+            </w:r>
+            <w:proofErr w:type="spellStart"/>
+            <w:r>
+              <w:t>nohupSE.out</w:t>
+            </w:r>
+            <w:proofErr w:type="spellEnd"/>
           </w:p>
         </w:tc>
       </w:tr>
@@ -304,8 +314,13 @@
             <w:tcW w:w="4536" w:type="dxa"/>
           </w:tcPr>
           <w:p>
-            <w:r>
-              <w:t>Nohup.out had messages without timestamps</w:t>
+            <w:proofErr w:type="spellStart"/>
+            <w:r>
+              <w:t>Nohup.out</w:t>
+            </w:r>
+            <w:proofErr w:type="spellEnd"/>
+            <w:r>
+              <w:t xml:space="preserve"> had messages without timestamps</w:t>
             </w:r>
           </w:p>
         </w:tc>
@@ -384,10 +399,40 @@
             <w:r>
               <w:t xml:space="preserve">as to terminators </w:t>
             </w:r>
-            <w:bookmarkStart w:id="0" w:name="_GoBack"/>
-            <w:bookmarkEnd w:id="0"/>
             <w:r>
               <w:t>is provided below in Additional Information</w:t>
+            </w:r>
+          </w:p>
+        </w:tc>
+      </w:tr>
+      <w:tr>
+        <w:tc>
+          <w:tcPr>
+            <w:tcW w:w="1101" w:type="dxa"/>
+          </w:tcPr>
+          <w:p>
+            <w:r>
+              <w:t>243</w:t>
+            </w:r>
+          </w:p>
+        </w:tc>
+        <w:tc>
+          <w:tcPr>
+            <w:tcW w:w="4536" w:type="dxa"/>
+          </w:tcPr>
+          <w:p>
+            <w:r>
+              <w:t>Support for lines terminated with just \r</w:t>
+            </w:r>
+          </w:p>
+        </w:tc>
+        <w:tc>
+          <w:tcPr>
+            <w:tcW w:w="4110" w:type="dxa"/>
+          </w:tcPr>
+          <w:p>
+            <w:r>
+              <w:t>Test records terminated with \r</w:t>
             </w:r>
           </w:p>
         </w:tc>
@@ -488,7 +533,21 @@
         <w:rPr>
           <w:rFonts w:ascii="Menlo" w:hAnsi="Menlo" w:cs="Menlo"/>
         </w:rPr>
-        <w:t xml:space="preserve"> &lt;connectorName&gt;</w:t>
+        <w:t xml:space="preserve"> &lt;</w:t>
+      </w:r>
+      <w:proofErr w:type="spellStart"/>
+      <w:r>
+        <w:rPr>
+          <w:rFonts w:ascii="Menlo" w:hAnsi="Menlo" w:cs="Menlo"/>
+        </w:rPr>
+        <w:t>connectorName</w:t>
+      </w:r>
+      <w:proofErr w:type="spellEnd"/>
+      <w:r>
+        <w:rPr>
+          <w:rFonts w:ascii="Menlo" w:hAnsi="Menlo" w:cs="Menlo"/>
+        </w:rPr>
+        <w:t>&gt;</w:t>
       </w:r>
       <w:r>
         <w:rPr>
@@ -506,7 +565,21 @@
         <w:rPr>
           <w:rFonts w:ascii="Menlo" w:hAnsi="Menlo" w:cs="Menlo"/>
         </w:rPr>
-        <w:t xml:space="preserve">d &lt;tableName&gt; &lt;filename&gt; </w:t>
+        <w:t>d &lt;</w:t>
+      </w:r>
+      <w:proofErr w:type="spellStart"/>
+      <w:r>
+        <w:rPr>
+          <w:rFonts w:ascii="Menlo" w:hAnsi="Menlo" w:cs="Menlo"/>
+        </w:rPr>
+        <w:t>tableName</w:t>
+      </w:r>
+      <w:proofErr w:type="spellEnd"/>
+      <w:r>
+        <w:rPr>
+          <w:rFonts w:ascii="Menlo" w:hAnsi="Menlo" w:cs="Menlo"/>
+        </w:rPr>
+        <w:t xml:space="preserve">&gt; &lt;filename&gt; </w:t>
       </w:r>
     </w:p>
     <w:p>
@@ -538,7 +611,14 @@
         <w:rPr>
           <w:rFonts w:ascii="Menlo" w:hAnsi="Menlo" w:cs="Menlo"/>
         </w:rPr>
-        <w:t xml:space="preserve">&lt;char&gt; </w:t>
+        <w:t>&lt;char</w:t>
+      </w:r>
+      <w:proofErr w:type="gramStart"/>
+      <w:r>
+        <w:rPr>
+          <w:rFonts w:ascii="Menlo" w:hAnsi="Menlo" w:cs="Menlo"/>
+        </w:rPr>
+        <w:t xml:space="preserve">&gt; </w:t>
       </w:r>
       <w:r>
         <w:rPr>
@@ -550,7 +630,14 @@
         <w:rPr>
           <w:rFonts w:ascii="Menlo" w:hAnsi="Menlo" w:cs="Menlo"/>
         </w:rPr>
-        <w:t>| none ]</w:t>
+        <w:t>|</w:t>
+      </w:r>
+      <w:proofErr w:type="gramEnd"/>
+      <w:r>
+        <w:rPr>
+          <w:rFonts w:ascii="Menlo" w:hAnsi="Menlo" w:cs="Menlo"/>
+        </w:rPr>
+        <w:t xml:space="preserve"> none ]</w:t>
       </w:r>
     </w:p>
     <w:p>
@@ -588,8 +675,16 @@
         <w:rPr>
           <w:rFonts w:ascii="Menlo" w:hAnsi="Menlo" w:cs="Menlo"/>
         </w:rPr>
-        <w:t>| none ]</w:t>
-      </w:r>
+        <w:t xml:space="preserve">| </w:t>
+      </w:r>
+      <w:proofErr w:type="gramStart"/>
+      <w:r>
+        <w:rPr>
+          <w:rFonts w:ascii="Menlo" w:hAnsi="Menlo" w:cs="Menlo"/>
+        </w:rPr>
+        <w:t>none ]</w:t>
+      </w:r>
+      <w:proofErr w:type="gramEnd"/>
     </w:p>
     <w:p>
       <w:pPr>
@@ -620,8 +715,16 @@
         <w:rPr>
           <w:rFonts w:ascii="Menlo" w:hAnsi="Menlo" w:cs="Menlo"/>
         </w:rPr>
-        <w:t xml:space="preserve"> &lt;char&gt; | none ]</w:t>
-      </w:r>
+        <w:t xml:space="preserve"> &lt;char&gt; | </w:t>
+      </w:r>
+      <w:proofErr w:type="gramStart"/>
+      <w:r>
+        <w:rPr>
+          <w:rFonts w:ascii="Menlo" w:hAnsi="Menlo" w:cs="Menlo"/>
+        </w:rPr>
+        <w:t>none ]</w:t>
+      </w:r>
+      <w:proofErr w:type="gramEnd"/>
     </w:p>
     <w:p>
       <w:pPr>
@@ -640,8 +743,16 @@
         <w:rPr>
           <w:rFonts w:ascii="Menlo" w:hAnsi="Menlo" w:cs="Menlo"/>
         </w:rPr>
-        <w:t xml:space="preserve"> &lt;char&gt; | none ]</w:t>
-      </w:r>
+        <w:t xml:space="preserve"> &lt;char&gt; | </w:t>
+      </w:r>
+      <w:proofErr w:type="gramStart"/>
+      <w:r>
+        <w:rPr>
+          <w:rFonts w:ascii="Menlo" w:hAnsi="Menlo" w:cs="Menlo"/>
+        </w:rPr>
+        <w:t>none ]</w:t>
+      </w:r>
+      <w:proofErr w:type="gramEnd"/>
     </w:p>
     <w:p>
       <w:pPr>
@@ -650,6 +761,7 @@
           <w:rFonts w:ascii="Menlo" w:hAnsi="Menlo" w:cs="Menlo"/>
         </w:rPr>
       </w:pPr>
+      <w:proofErr w:type="gramStart"/>
       <w:r>
         <w:rPr>
           <w:rFonts w:ascii="Menlo" w:hAnsi="Menlo" w:cs="Menlo"/>
@@ -660,7 +772,28 @@
         <w:rPr>
           <w:rFonts w:ascii="Menlo" w:hAnsi="Menlo" w:cs="Menlo"/>
         </w:rPr>
-        <w:t xml:space="preserve"> WITH NODE = ‘&lt;nodeName&gt;’ </w:t>
+        <w:t xml:space="preserve"> WITH</w:t>
+      </w:r>
+      <w:proofErr w:type="gramEnd"/>
+      <w:r>
+        <w:rPr>
+          <w:rFonts w:ascii="Menlo" w:hAnsi="Menlo" w:cs="Menlo"/>
+        </w:rPr>
+        <w:t xml:space="preserve"> NODE = ‘&lt;</w:t>
+      </w:r>
+      <w:proofErr w:type="spellStart"/>
+      <w:r>
+        <w:rPr>
+          <w:rFonts w:ascii="Menlo" w:hAnsi="Menlo" w:cs="Menlo"/>
+        </w:rPr>
+        <w:t>nodeName</w:t>
+      </w:r>
+      <w:proofErr w:type="spellEnd"/>
+      <w:r>
+        <w:rPr>
+          <w:rFonts w:ascii="Menlo" w:hAnsi="Menlo" w:cs="Menlo"/>
+        </w:rPr>
+        <w:t xml:space="preserve">&gt;’ </w:t>
       </w:r>
       <w:r>
         <w:rPr>
@@ -691,11 +824,33 @@
       <w:r>
         <w:tab/>
       </w:r>
-      <w:r>
-        <w:rPr>
-          <w:rFonts w:ascii="Menlo" w:hAnsi="Menlo" w:cs="Menlo"/>
-        </w:rPr>
-        <w:t>ld &lt;tableName&gt; “&lt;filename&gt;”</w:t>
+      <w:proofErr w:type="spellStart"/>
+      <w:r>
+        <w:rPr>
+          <w:rFonts w:ascii="Menlo" w:hAnsi="Menlo" w:cs="Menlo"/>
+        </w:rPr>
+        <w:t>ld</w:t>
+      </w:r>
+      <w:proofErr w:type="spellEnd"/>
+      <w:r>
+        <w:rPr>
+          <w:rFonts w:ascii="Menlo" w:hAnsi="Menlo" w:cs="Menlo"/>
+        </w:rPr>
+        <w:t xml:space="preserve"> &lt;</w:t>
+      </w:r>
+      <w:proofErr w:type="spellStart"/>
+      <w:r>
+        <w:rPr>
+          <w:rFonts w:ascii="Menlo" w:hAnsi="Menlo" w:cs="Menlo"/>
+        </w:rPr>
+        <w:t>tableName</w:t>
+      </w:r>
+      <w:proofErr w:type="spellEnd"/>
+      <w:r>
+        <w:rPr>
+          <w:rFonts w:ascii="Menlo" w:hAnsi="Menlo" w:cs="Menlo"/>
+        </w:rPr>
+        <w:t>&gt; “&lt;filename&gt;”</w:t>
       </w:r>
     </w:p>
     <w:p>
@@ -709,7 +864,14 @@
         <w:rPr>
           <w:rFonts w:ascii="Menlo" w:hAnsi="Menlo" w:cs="Menlo"/>
         </w:rPr>
-        <w:t xml:space="preserve">[ TERMINATOR “&lt;char&gt;” </w:t>
+        <w:t>[ TERMINATOR “&lt;char</w:t>
+      </w:r>
+      <w:proofErr w:type="gramStart"/>
+      <w:r>
+        <w:rPr>
+          <w:rFonts w:ascii="Menlo" w:hAnsi="Menlo" w:cs="Menlo"/>
+        </w:rPr>
+        <w:t xml:space="preserve">&gt;” </w:t>
       </w:r>
       <w:r>
         <w:rPr>
@@ -721,6 +883,47 @@
         <w:rPr>
           <w:rFonts w:ascii="Menlo" w:hAnsi="Menlo" w:cs="Menlo"/>
         </w:rPr>
+        <w:t>|</w:t>
+      </w:r>
+      <w:proofErr w:type="gramEnd"/>
+      <w:r>
+        <w:rPr>
+          <w:rFonts w:ascii="Menlo" w:hAnsi="Menlo" w:cs="Menlo"/>
+        </w:rPr>
+        <w:t xml:space="preserve"> “\0” ]</w:t>
+      </w:r>
+    </w:p>
+    <w:p>
+      <w:pPr>
+        <w:ind w:left="720" w:firstLine="720"/>
+        <w:rPr>
+          <w:rFonts w:ascii="Menlo" w:hAnsi="Menlo" w:cs="Menlo"/>
+        </w:rPr>
+      </w:pPr>
+      <w:r>
+        <w:rPr>
+          <w:rFonts w:ascii="Menlo" w:hAnsi="Menlo" w:cs="Menlo"/>
+        </w:rPr>
+        <w:t>[ DELIMITER “&lt;char</w:t>
+      </w:r>
+      <w:proofErr w:type="gramStart"/>
+      <w:r>
+        <w:rPr>
+          <w:rFonts w:ascii="Menlo" w:hAnsi="Menlo" w:cs="Menlo"/>
+        </w:rPr>
+        <w:t xml:space="preserve">&gt;” </w:t>
+      </w:r>
+      <w:r>
+        <w:rPr>
+          <w:rFonts w:ascii="Menlo" w:hAnsi="Menlo" w:cs="Menlo"/>
+        </w:rPr>
+        <w:t xml:space="preserve">  </w:t>
+      </w:r>
+      <w:proofErr w:type="gramEnd"/>
+      <w:r>
+        <w:rPr>
+          <w:rFonts w:ascii="Menlo" w:hAnsi="Menlo" w:cs="Menlo"/>
+        </w:rPr>
         <w:t>| “\0” ]</w:t>
       </w:r>
     </w:p>
@@ -735,20 +938,28 @@
         <w:rPr>
           <w:rFonts w:ascii="Menlo" w:hAnsi="Menlo" w:cs="Menlo"/>
         </w:rPr>
-        <w:t xml:space="preserve">[ DELIMITER “&lt;char&gt;” </w:t>
-      </w:r>
-      <w:r>
-        <w:rPr>
-          <w:rFonts w:ascii="Menlo" w:hAnsi="Menlo" w:cs="Menlo"/>
-        </w:rPr>
-        <w:t xml:space="preserve">  </w:t>
-      </w:r>
-      <w:r>
-        <w:rPr>
-          <w:rFonts w:ascii="Menlo" w:hAnsi="Menlo" w:cs="Menlo"/>
-        </w:rPr>
-        <w:t>| “\0” ]</w:t>
-      </w:r>
+        <w:t>[ ENCLOSED_BY “&lt;char&gt;” | “\0</w:t>
+      </w:r>
+      <w:proofErr w:type="gramStart"/>
+      <w:r>
+        <w:rPr>
+          <w:rFonts w:ascii="Menlo" w:hAnsi="Menlo" w:cs="Menlo"/>
+        </w:rPr>
+        <w:t>”</w:t>
+      </w:r>
+      <w:r>
+        <w:rPr>
+          <w:rFonts w:ascii="Menlo" w:hAnsi="Menlo" w:cs="Menlo"/>
+        </w:rPr>
+        <w:t xml:space="preserve"> </w:t>
+      </w:r>
+      <w:r>
+        <w:rPr>
+          <w:rFonts w:ascii="Menlo" w:hAnsi="Menlo" w:cs="Menlo"/>
+        </w:rPr>
+        <w:t>]</w:t>
+      </w:r>
+      <w:proofErr w:type="gramEnd"/>
     </w:p>
     <w:p>
       <w:pPr>
@@ -761,34 +972,16 @@
         <w:rPr>
           <w:rFonts w:ascii="Menlo" w:hAnsi="Menlo" w:cs="Menlo"/>
         </w:rPr>
-        <w:t>[ ENCLOSED_BY “&lt;char&gt;” | “\0”</w:t>
-      </w:r>
-      <w:r>
-        <w:rPr>
-          <w:rFonts w:ascii="Menlo" w:hAnsi="Menlo" w:cs="Menlo"/>
-        </w:rPr>
-        <w:t xml:space="preserve"> </w:t>
-      </w:r>
-      <w:r>
-        <w:rPr>
-          <w:rFonts w:ascii="Menlo" w:hAnsi="Menlo" w:cs="Menlo"/>
-        </w:rPr>
-        <w:t>]</w:t>
-      </w:r>
-    </w:p>
-    <w:p>
-      <w:pPr>
-        <w:ind w:left="720" w:firstLine="720"/>
-        <w:rPr>
-          <w:rFonts w:ascii="Menlo" w:hAnsi="Menlo" w:cs="Menlo"/>
-        </w:rPr>
-      </w:pPr>
-      <w:r>
-        <w:rPr>
-          <w:rFonts w:ascii="Menlo" w:hAnsi="Menlo" w:cs="Menlo"/>
-        </w:rPr>
-        <w:t>[ ESCAPE_CHAR “&lt;char&gt;” | “\0” ]</w:t>
-      </w:r>
+        <w:t>[ ESCAPE_CHAR “&lt;char&gt;” | “\0</w:t>
+      </w:r>
+      <w:proofErr w:type="gramStart"/>
+      <w:r>
+        <w:rPr>
+          <w:rFonts w:ascii="Menlo" w:hAnsi="Menlo" w:cs="Menlo"/>
+        </w:rPr>
+        <w:t>” ]</w:t>
+      </w:r>
+      <w:proofErr w:type="gramEnd"/>
     </w:p>
     <w:p>
       <w:pPr>
@@ -1098,10 +1291,18 @@
         <w:t>looking</w:t>
       </w:r>
       <w:r>
-        <w:t xml:space="preserve"> at the nohup</w:t>
-      </w:r>
-      <w:r>
-        <w:t>.out file on the loading node</w:t>
+        <w:t xml:space="preserve"> at the </w:t>
+      </w:r>
+      <w:proofErr w:type="spellStart"/>
+      <w:r>
+        <w:t>nohup</w:t>
+      </w:r>
+      <w:r>
+        <w:t>.out</w:t>
+      </w:r>
+      <w:proofErr w:type="spellEnd"/>
+      <w:r>
+        <w:t xml:space="preserve"> file on the loading node</w:t>
       </w:r>
       <w:r>
         <w:t>.</w:t>

</xml_diff>

<commit_message>
updated checkin doc with latest release.
Former-commit-id: fba87b6127d03b5a8b84d3a520a0c8d6eeb02ebf
</commit_message>
<xml_diff>
--- a/Checkins/CheckinReport CSV Parsing.docx
+++ b/Checkins/CheckinReport CSV Parsing.docx
@@ -7,49 +7,46 @@
         <w:t xml:space="preserve">DATE:  </w:t>
       </w:r>
       <w:r>
-        <w:t>D</w:t>
+        <w:t xml:space="preserve">Dec </w:t>
+      </w:r>
+      <w:r>
+        <w:t>22</w:t>
+      </w:r>
+      <w:r>
+        <w:t>,</w:t>
+      </w:r>
+      <w:r>
+        <w:t xml:space="preserve"> 2017</w:t>
+      </w:r>
+    </w:p>
+    <w:p/>
+    <w:p>
+      <w:r>
+        <w:t xml:space="preserve">DEVELOPER: </w:t>
+      </w:r>
+      <w:r>
+        <w:t>Alka &amp; Ray</w:t>
+      </w:r>
+    </w:p>
+    <w:p/>
+    <w:p>
+      <w:r>
+        <w:t>PRODUCT:</w:t>
+      </w:r>
+      <w:r>
+        <w:t xml:space="preserve"> SE</w:t>
+      </w:r>
+    </w:p>
+    <w:p/>
+    <w:p>
+      <w:r>
+        <w:t xml:space="preserve">CHECK-IN/HASH (from bitbucket.org) </w:t>
+      </w:r>
+      <w:r>
+        <w:t>8f8d251</w:t>
       </w:r>
       <w:bookmarkStart w:id="0" w:name="_GoBack"/>
       <w:bookmarkEnd w:id="0"/>
-      <w:r>
-        <w:t xml:space="preserve">ec </w:t>
-      </w:r>
-      <w:r>
-        <w:t>22</w:t>
-      </w:r>
-      <w:r>
-        <w:t>,</w:t>
-      </w:r>
-      <w:r>
-        <w:t xml:space="preserve"> 2017</w:t>
-      </w:r>
-    </w:p>
-    <w:p/>
-    <w:p>
-      <w:r>
-        <w:t xml:space="preserve">DEVELOPER: </w:t>
-      </w:r>
-      <w:r>
-        <w:t>Alka &amp; Ray</w:t>
-      </w:r>
-    </w:p>
-    <w:p/>
-    <w:p>
-      <w:r>
-        <w:t>PRODUCT:</w:t>
-      </w:r>
-      <w:r>
-        <w:t xml:space="preserve"> SE</w:t>
-      </w:r>
-    </w:p>
-    <w:p/>
-    <w:p>
-      <w:r>
-        <w:t xml:space="preserve">CHECK-IN/HASH (from bitbucket.org) </w:t>
-      </w:r>
-      <w:r>
-        <w:t>b471157</w:t>
-      </w:r>
     </w:p>
     <w:p/>
     <w:p/>
@@ -288,13 +285,8 @@
           </w:tcPr>
           <w:p>
             <w:r>
-              <w:t xml:space="preserve">File name should be </w:t>
-            </w:r>
-            <w:proofErr w:type="spellStart"/>
-            <w:r>
-              <w:t>nohupSE.out</w:t>
-            </w:r>
-            <w:proofErr w:type="spellEnd"/>
+              <w:t>File name should be nohupSE.out</w:t>
+            </w:r>
           </w:p>
         </w:tc>
       </w:tr>
@@ -314,13 +306,8 @@
             <w:tcW w:w="4536" w:type="dxa"/>
           </w:tcPr>
           <w:p>
-            <w:proofErr w:type="spellStart"/>
-            <w:r>
-              <w:t>Nohup.out</w:t>
-            </w:r>
-            <w:proofErr w:type="spellEnd"/>
-            <w:r>
-              <w:t xml:space="preserve"> had messages without timestamps</w:t>
+            <w:r>
+              <w:t>Nohup.out had messages without timestamps</w:t>
             </w:r>
           </w:p>
         </w:tc>
@@ -437,6 +424,38 @@
           </w:p>
         </w:tc>
       </w:tr>
+      <w:tr>
+        <w:tc>
+          <w:tcPr>
+            <w:tcW w:w="1101" w:type="dxa"/>
+          </w:tcPr>
+          <w:p>
+            <w:r>
+              <w:t>245</w:t>
+            </w:r>
+          </w:p>
+        </w:tc>
+        <w:tc>
+          <w:tcPr>
+            <w:tcW w:w="4536" w:type="dxa"/>
+          </w:tcPr>
+          <w:p>
+            <w:r>
+              <w:t>SE was not handling the case when terminator specified and no terminator at end of row.</w:t>
+            </w:r>
+          </w:p>
+        </w:tc>
+        <w:tc>
+          <w:tcPr>
+            <w:tcW w:w="4110" w:type="dxa"/>
+          </w:tcPr>
+          <w:p>
+            <w:r>
+              <w:t>Test with terminator specified and have rows not terminated with terminator</w:t>
+            </w:r>
+          </w:p>
+        </w:tc>
+      </w:tr>
     </w:tbl>
     <w:p/>
     <w:p/>
@@ -533,21 +552,7 @@
         <w:rPr>
           <w:rFonts w:ascii="Menlo" w:hAnsi="Menlo" w:cs="Menlo"/>
         </w:rPr>
-        <w:t xml:space="preserve"> &lt;</w:t>
-      </w:r>
-      <w:proofErr w:type="spellStart"/>
-      <w:r>
-        <w:rPr>
-          <w:rFonts w:ascii="Menlo" w:hAnsi="Menlo" w:cs="Menlo"/>
-        </w:rPr>
-        <w:t>connectorName</w:t>
-      </w:r>
-      <w:proofErr w:type="spellEnd"/>
-      <w:r>
-        <w:rPr>
-          <w:rFonts w:ascii="Menlo" w:hAnsi="Menlo" w:cs="Menlo"/>
-        </w:rPr>
-        <w:t>&gt;</w:t>
+        <w:t xml:space="preserve"> &lt;connectorName&gt;</w:t>
       </w:r>
       <w:r>
         <w:rPr>
@@ -565,21 +570,7 @@
         <w:rPr>
           <w:rFonts w:ascii="Menlo" w:hAnsi="Menlo" w:cs="Menlo"/>
         </w:rPr>
-        <w:t>d &lt;</w:t>
-      </w:r>
-      <w:proofErr w:type="spellStart"/>
-      <w:r>
-        <w:rPr>
-          <w:rFonts w:ascii="Menlo" w:hAnsi="Menlo" w:cs="Menlo"/>
-        </w:rPr>
-        <w:t>tableName</w:t>
-      </w:r>
-      <w:proofErr w:type="spellEnd"/>
-      <w:r>
-        <w:rPr>
-          <w:rFonts w:ascii="Menlo" w:hAnsi="Menlo" w:cs="Menlo"/>
-        </w:rPr>
-        <w:t xml:space="preserve">&gt; &lt;filename&gt; </w:t>
+        <w:t xml:space="preserve">d &lt;tableName&gt; &lt;filename&gt; </w:t>
       </w:r>
     </w:p>
     <w:p>
@@ -611,14 +602,7 @@
         <w:rPr>
           <w:rFonts w:ascii="Menlo" w:hAnsi="Menlo" w:cs="Menlo"/>
         </w:rPr>
-        <w:t>&lt;char</w:t>
-      </w:r>
-      <w:proofErr w:type="gramStart"/>
-      <w:r>
-        <w:rPr>
-          <w:rFonts w:ascii="Menlo" w:hAnsi="Menlo" w:cs="Menlo"/>
-        </w:rPr>
-        <w:t xml:space="preserve">&gt; </w:t>
+        <w:t xml:space="preserve">&lt;char&gt; </w:t>
       </w:r>
       <w:r>
         <w:rPr>
@@ -630,14 +614,7 @@
         <w:rPr>
           <w:rFonts w:ascii="Menlo" w:hAnsi="Menlo" w:cs="Menlo"/>
         </w:rPr>
-        <w:t>|</w:t>
-      </w:r>
-      <w:proofErr w:type="gramEnd"/>
-      <w:r>
-        <w:rPr>
-          <w:rFonts w:ascii="Menlo" w:hAnsi="Menlo" w:cs="Menlo"/>
-        </w:rPr>
-        <w:t xml:space="preserve"> none ]</w:t>
+        <w:t>| none ]</w:t>
       </w:r>
     </w:p>
     <w:p>
@@ -675,16 +652,8 @@
         <w:rPr>
           <w:rFonts w:ascii="Menlo" w:hAnsi="Menlo" w:cs="Menlo"/>
         </w:rPr>
-        <w:t xml:space="preserve">| </w:t>
-      </w:r>
-      <w:proofErr w:type="gramStart"/>
-      <w:r>
-        <w:rPr>
-          <w:rFonts w:ascii="Menlo" w:hAnsi="Menlo" w:cs="Menlo"/>
-        </w:rPr>
-        <w:t>none ]</w:t>
-      </w:r>
-      <w:proofErr w:type="gramEnd"/>
+        <w:t>| none ]</w:t>
+      </w:r>
     </w:p>
     <w:p>
       <w:pPr>
@@ -715,16 +684,8 @@
         <w:rPr>
           <w:rFonts w:ascii="Menlo" w:hAnsi="Menlo" w:cs="Menlo"/>
         </w:rPr>
-        <w:t xml:space="preserve"> &lt;char&gt; | </w:t>
-      </w:r>
-      <w:proofErr w:type="gramStart"/>
-      <w:r>
-        <w:rPr>
-          <w:rFonts w:ascii="Menlo" w:hAnsi="Menlo" w:cs="Menlo"/>
-        </w:rPr>
-        <w:t>none ]</w:t>
-      </w:r>
-      <w:proofErr w:type="gramEnd"/>
+        <w:t xml:space="preserve"> &lt;char&gt; | none ]</w:t>
+      </w:r>
     </w:p>
     <w:p>
       <w:pPr>
@@ -743,16 +704,8 @@
         <w:rPr>
           <w:rFonts w:ascii="Menlo" w:hAnsi="Menlo" w:cs="Menlo"/>
         </w:rPr>
-        <w:t xml:space="preserve"> &lt;char&gt; | </w:t>
-      </w:r>
-      <w:proofErr w:type="gramStart"/>
-      <w:r>
-        <w:rPr>
-          <w:rFonts w:ascii="Menlo" w:hAnsi="Menlo" w:cs="Menlo"/>
-        </w:rPr>
-        <w:t>none ]</w:t>
-      </w:r>
-      <w:proofErr w:type="gramEnd"/>
+        <w:t xml:space="preserve"> &lt;char&gt; | none ]</w:t>
+      </w:r>
     </w:p>
     <w:p>
       <w:pPr>
@@ -761,7 +714,6 @@
           <w:rFonts w:ascii="Menlo" w:hAnsi="Menlo" w:cs="Menlo"/>
         </w:rPr>
       </w:pPr>
-      <w:proofErr w:type="gramStart"/>
       <w:r>
         <w:rPr>
           <w:rFonts w:ascii="Menlo" w:hAnsi="Menlo" w:cs="Menlo"/>
@@ -772,28 +724,7 @@
         <w:rPr>
           <w:rFonts w:ascii="Menlo" w:hAnsi="Menlo" w:cs="Menlo"/>
         </w:rPr>
-        <w:t xml:space="preserve"> WITH</w:t>
-      </w:r>
-      <w:proofErr w:type="gramEnd"/>
-      <w:r>
-        <w:rPr>
-          <w:rFonts w:ascii="Menlo" w:hAnsi="Menlo" w:cs="Menlo"/>
-        </w:rPr>
-        <w:t xml:space="preserve"> NODE = ‘&lt;</w:t>
-      </w:r>
-      <w:proofErr w:type="spellStart"/>
-      <w:r>
-        <w:rPr>
-          <w:rFonts w:ascii="Menlo" w:hAnsi="Menlo" w:cs="Menlo"/>
-        </w:rPr>
-        <w:t>nodeName</w:t>
-      </w:r>
-      <w:proofErr w:type="spellEnd"/>
-      <w:r>
-        <w:rPr>
-          <w:rFonts w:ascii="Menlo" w:hAnsi="Menlo" w:cs="Menlo"/>
-        </w:rPr>
-        <w:t xml:space="preserve">&gt;’ </w:t>
+        <w:t xml:space="preserve"> WITH NODE = ‘&lt;nodeName&gt;’ </w:t>
       </w:r>
       <w:r>
         <w:rPr>
@@ -805,6 +736,7 @@
     <w:p/>
     <w:p>
       <w:r>
+        <w:lastRenderedPageBreak/>
         <w:br w:type="page"/>
       </w:r>
     </w:p>
@@ -824,33 +756,11 @@
       <w:r>
         <w:tab/>
       </w:r>
-      <w:proofErr w:type="spellStart"/>
-      <w:r>
-        <w:rPr>
-          <w:rFonts w:ascii="Menlo" w:hAnsi="Menlo" w:cs="Menlo"/>
-        </w:rPr>
-        <w:t>ld</w:t>
-      </w:r>
-      <w:proofErr w:type="spellEnd"/>
-      <w:r>
-        <w:rPr>
-          <w:rFonts w:ascii="Menlo" w:hAnsi="Menlo" w:cs="Menlo"/>
-        </w:rPr>
-        <w:t xml:space="preserve"> &lt;</w:t>
-      </w:r>
-      <w:proofErr w:type="spellStart"/>
-      <w:r>
-        <w:rPr>
-          <w:rFonts w:ascii="Menlo" w:hAnsi="Menlo" w:cs="Menlo"/>
-        </w:rPr>
-        <w:t>tableName</w:t>
-      </w:r>
-      <w:proofErr w:type="spellEnd"/>
-      <w:r>
-        <w:rPr>
-          <w:rFonts w:ascii="Menlo" w:hAnsi="Menlo" w:cs="Menlo"/>
-        </w:rPr>
-        <w:t>&gt; “&lt;filename&gt;”</w:t>
+      <w:r>
+        <w:rPr>
+          <w:rFonts w:ascii="Menlo" w:hAnsi="Menlo" w:cs="Menlo"/>
+        </w:rPr>
+        <w:t>ld &lt;tableName&gt; “&lt;filename&gt;”</w:t>
       </w:r>
     </w:p>
     <w:p>
@@ -864,14 +774,7 @@
         <w:rPr>
           <w:rFonts w:ascii="Menlo" w:hAnsi="Menlo" w:cs="Menlo"/>
         </w:rPr>
-        <w:t>[ TERMINATOR “&lt;char</w:t>
-      </w:r>
-      <w:proofErr w:type="gramStart"/>
-      <w:r>
-        <w:rPr>
-          <w:rFonts w:ascii="Menlo" w:hAnsi="Menlo" w:cs="Menlo"/>
-        </w:rPr>
-        <w:t xml:space="preserve">&gt;” </w:t>
+        <w:t xml:space="preserve">[ TERMINATOR “&lt;char&gt;” </w:t>
       </w:r>
       <w:r>
         <w:rPr>
@@ -883,14 +786,7 @@
         <w:rPr>
           <w:rFonts w:ascii="Menlo" w:hAnsi="Menlo" w:cs="Menlo"/>
         </w:rPr>
-        <w:t>|</w:t>
-      </w:r>
-      <w:proofErr w:type="gramEnd"/>
-      <w:r>
-        <w:rPr>
-          <w:rFonts w:ascii="Menlo" w:hAnsi="Menlo" w:cs="Menlo"/>
-        </w:rPr>
-        <w:t xml:space="preserve"> “\0” ]</w:t>
+        <w:t>| “\0” ]</w:t>
       </w:r>
     </w:p>
     <w:p>
@@ -904,14 +800,7 @@
         <w:rPr>
           <w:rFonts w:ascii="Menlo" w:hAnsi="Menlo" w:cs="Menlo"/>
         </w:rPr>
-        <w:t>[ DELIMITER “&lt;char</w:t>
-      </w:r>
-      <w:proofErr w:type="gramStart"/>
-      <w:r>
-        <w:rPr>
-          <w:rFonts w:ascii="Menlo" w:hAnsi="Menlo" w:cs="Menlo"/>
-        </w:rPr>
-        <w:t xml:space="preserve">&gt;” </w:t>
+        <w:t xml:space="preserve">[ DELIMITER “&lt;char&gt;” </w:t>
       </w:r>
       <w:r>
         <w:rPr>
@@ -919,7 +808,6 @@
         </w:rPr>
         <w:t xml:space="preserve">  </w:t>
       </w:r>
-      <w:proofErr w:type="gramEnd"/>
       <w:r>
         <w:rPr>
           <w:rFonts w:ascii="Menlo" w:hAnsi="Menlo" w:cs="Menlo"/>
@@ -938,14 +826,7 @@
         <w:rPr>
           <w:rFonts w:ascii="Menlo" w:hAnsi="Menlo" w:cs="Menlo"/>
         </w:rPr>
-        <w:t>[ ENCLOSED_BY “&lt;char&gt;” | “\0</w:t>
-      </w:r>
-      <w:proofErr w:type="gramStart"/>
-      <w:r>
-        <w:rPr>
-          <w:rFonts w:ascii="Menlo" w:hAnsi="Menlo" w:cs="Menlo"/>
-        </w:rPr>
-        <w:t>”</w:t>
+        <w:t>[ ENCLOSED_BY “&lt;char&gt;” | “\0”</w:t>
       </w:r>
       <w:r>
         <w:rPr>
@@ -959,7 +840,6 @@
         </w:rPr>
         <w:t>]</w:t>
       </w:r>
-      <w:proofErr w:type="gramEnd"/>
     </w:p>
     <w:p>
       <w:pPr>
@@ -972,16 +852,8 @@
         <w:rPr>
           <w:rFonts w:ascii="Menlo" w:hAnsi="Menlo" w:cs="Menlo"/>
         </w:rPr>
-        <w:t>[ ESCAPE_CHAR “&lt;char&gt;” | “\0</w:t>
-      </w:r>
-      <w:proofErr w:type="gramStart"/>
-      <w:r>
-        <w:rPr>
-          <w:rFonts w:ascii="Menlo" w:hAnsi="Menlo" w:cs="Menlo"/>
-        </w:rPr>
-        <w:t>” ]</w:t>
-      </w:r>
-      <w:proofErr w:type="gramEnd"/>
+        <w:t>[ ESCAPE_CHAR “&lt;char&gt;” | “\0” ]</w:t>
+      </w:r>
     </w:p>
     <w:p>
       <w:pPr>
@@ -1291,18 +1163,10 @@
         <w:t>looking</w:t>
       </w:r>
       <w:r>
-        <w:t xml:space="preserve"> at the </w:t>
-      </w:r>
-      <w:proofErr w:type="spellStart"/>
-      <w:r>
-        <w:t>nohup</w:t>
-      </w:r>
-      <w:r>
-        <w:t>.out</w:t>
-      </w:r>
-      <w:proofErr w:type="spellEnd"/>
-      <w:r>
-        <w:t xml:space="preserve"> file on the loading node</w:t>
+        <w:t xml:space="preserve"> at the nohup</w:t>
+      </w:r>
+      <w:r>
+        <w:t>.out file on the loading node</w:t>
       </w:r>
       <w:r>
         <w:t>.</w:t>

</xml_diff>

<commit_message>
checkin report for todays fix.
Former-commit-id: b45a1786d0f45701d51cee28ba564f9f421de1d6
</commit_message>
<xml_diff>
--- a/Checkins/CheckinReport CSV Parsing.docx
+++ b/Checkins/CheckinReport CSV Parsing.docx
@@ -43,7 +43,7 @@
         <w:t xml:space="preserve">CHECK-IN/HASH (from bitbucket.org) </w:t>
       </w:r>
       <w:r>
-        <w:t>affd215</w:t>
+        <w:t>29ccd90</w:t>
       </w:r>
       <w:bookmarkStart w:id="0" w:name="_GoBack"/>
       <w:bookmarkEnd w:id="0"/>
@@ -555,6 +555,46 @@
           </w:p>
         </w:tc>
       </w:tr>
+      <w:tr>
+        <w:trPr>
+          <w:trHeight w:val="244"/>
+        </w:trPr>
+        <w:tc>
+          <w:tcPr>
+            <w:tcW w:w="1101" w:type="dxa"/>
+          </w:tcPr>
+          <w:p>
+            <w:r>
+              <w:t>260</w:t>
+            </w:r>
+          </w:p>
+        </w:tc>
+        <w:tc>
+          <w:tcPr>
+            <w:tcW w:w="4536" w:type="dxa"/>
+          </w:tcPr>
+          <w:p>
+            <w:r>
+              <w:t>If incorrect parameter was passed to escape load command rdp was just ignoring it.</w:t>
+            </w:r>
+          </w:p>
+          <w:p>
+            <w:r>
+              <w:t>It now throws an exception.</w:t>
+            </w:r>
+          </w:p>
+        </w:tc>
+        <w:tc>
+          <w:tcPr>
+            <w:tcW w:w="4110" w:type="dxa"/>
+          </w:tcPr>
+          <w:p>
+            <w:r>
+              <w:t>Test escape load and export with invalid parameters.</w:t>
+            </w:r>
+          </w:p>
+        </w:tc>
+      </w:tr>
     </w:tbl>
     <w:p/>
     <w:p/>
@@ -1207,6 +1247,7 @@
         </w:numPr>
       </w:pPr>
       <w:r>
+        <w:lastRenderedPageBreak/>
         <w:t xml:space="preserve">The defaults </w:t>
       </w:r>
       <w:r>
@@ -1287,7 +1328,6 @@
         <w:rPr>
           <w:rFonts w:ascii="Menlo" w:hAnsi="Menlo" w:cs="Menlo"/>
         </w:rPr>
-        <w:lastRenderedPageBreak/>
         <w:tab/>
         <w:t>ENCLOSED_BY</w:t>
       </w:r>

</xml_diff>

<commit_message>
Checkin report from Release0.3x branch. Also a couple of fixes in timestamp tests that needed to be done with the tsp changes.
Former-commit-id: 0ca00f41235e78ec37cb347f22fca94145c0b73e
</commit_message>
<xml_diff>
--- a/Checkins/CheckinReport CSV Parsing.docx
+++ b/Checkins/CheckinReport CSV Parsing.docx
@@ -43,10 +43,8 @@
         <w:t xml:space="preserve">CHECK-IN/HASH (from bitbucket.org) </w:t>
       </w:r>
       <w:r>
-        <w:t>affd215</w:t>
-      </w:r>
-      <w:bookmarkStart w:id="0" w:name="_GoBack"/>
-      <w:bookmarkEnd w:id="0"/>
+        <w:t>0481812</w:t>
+      </w:r>
     </w:p>
     <w:p/>
     <w:p/>
@@ -1476,9 +1474,78 @@
     </w:p>
     <w:p>
       <w:pPr>
+        <w:rPr>
+          <w:rFonts w:ascii="Calibri" w:eastAsia="Times New Roman" w:hAnsi="Calibri" w:cs="Tahoma"/>
+          <w:color w:val="212121"/>
+          <w:sz w:val="23"/>
+          <w:szCs w:val="23"/>
+          <w:lang w:val="en-GB" w:eastAsia="en-GB"/>
+        </w:rPr>
+      </w:pPr>
+    </w:p>
+    <w:p>
+      <w:pPr>
+        <w:pStyle w:val="ListParagraph"/>
+        <w:numPr>
+          <w:ilvl w:val="0"/>
+          <w:numId w:val="3"/>
+        </w:numPr>
+        <w:rPr>
+          <w:rFonts w:ascii="Calibri" w:eastAsia="Times New Roman" w:hAnsi="Calibri" w:cs="Tahoma"/>
+          <w:color w:val="212121"/>
+          <w:sz w:val="23"/>
+          <w:szCs w:val="23"/>
+          <w:lang w:val="en-GB" w:eastAsia="en-GB"/>
+        </w:rPr>
+      </w:pPr>
+      <w:r>
+        <w:rPr>
+          <w:rFonts w:ascii="Calibri" w:eastAsia="Times New Roman" w:hAnsi="Calibri" w:cs="Tahoma"/>
+          <w:color w:val="212121"/>
+          <w:sz w:val="23"/>
+          <w:szCs w:val="23"/>
+          <w:lang w:val="en-GB" w:eastAsia="en-GB"/>
+        </w:rPr>
+        <w:t>Timestamp now supports microseconds in the fractional part.</w:t>
+      </w:r>
+      <w:r>
+        <w:rPr>
+          <w:rFonts w:ascii="Calibri" w:eastAsia="Times New Roman" w:hAnsi="Calibri" w:cs="Tahoma"/>
+          <w:color w:val="212121"/>
+          <w:sz w:val="23"/>
+          <w:szCs w:val="23"/>
+          <w:lang w:val="en-GB" w:eastAsia="en-GB"/>
+        </w:rPr>
+        <w:t xml:space="preserve"> So it allows for 6 digits in the fractional part. If greater than 6 digits are there in the </w:t>
+      </w:r>
+      <w:r>
+        <w:rPr>
+          <w:rFonts w:ascii="Calibri" w:eastAsia="Times New Roman" w:hAnsi="Calibri" w:cs="Tahoma"/>
+          <w:color w:val="212121"/>
+          <w:sz w:val="23"/>
+          <w:szCs w:val="23"/>
+          <w:lang w:val="en-GB" w:eastAsia="en-GB"/>
+        </w:rPr>
+        <w:t xml:space="preserve">fractional part of the timestamp </w:t>
+      </w:r>
+      <w:r>
+        <w:rPr>
+          <w:rFonts w:ascii="Calibri" w:eastAsia="Times New Roman" w:hAnsi="Calibri" w:cs="Tahoma"/>
+          <w:color w:val="212121"/>
+          <w:sz w:val="23"/>
+          <w:szCs w:val="23"/>
+          <w:lang w:val="en-GB" w:eastAsia="en-GB"/>
+        </w:rPr>
+        <w:t>then SE will truncate the trailing digits.</w:t>
+      </w:r>
+    </w:p>
+    <w:p>
+      <w:pPr>
         <w:pStyle w:val="ListParagraph"/>
         <w:ind w:left="360"/>
       </w:pPr>
+      <w:bookmarkStart w:id="0" w:name="_GoBack"/>
+      <w:bookmarkEnd w:id="0"/>
     </w:p>
     <w:sectPr>
       <w:pgSz w:w="12240" w:h="15840"/>

</xml_diff>